<commit_message>
tests explained: unit, fuzz, invariant
</commit_message>
<xml_diff>
--- a/1 - EVM and Etherium.docx
+++ b/1 - EVM and Etherium.docx
@@ -1,12 +1,60 @@
 
 <file path=word/document.xml><?xml version="1.0" encoding="utf-8"?>
-<w:document xmlns:wpc="http://schemas.microsoft.com/office/word/2010/wordprocessingCanvas" xmlns:cx="http://schemas.microsoft.com/office/drawing/2014/chartex" xmlns:cx1="http://schemas.microsoft.com/office/drawing/2015/9/8/chartex" xmlns:cx2="http://schemas.microsoft.com/office/drawing/2015/10/21/chartex" xmlns:cx3="http://schemas.microsoft.com/office/drawing/2016/5/9/chartex" xmlns:cx4="http://schemas.microsoft.com/office/drawing/2016/5/10/chartex" xmlns:cx5="http://schemas.microsoft.com/office/drawing/2016/5/11/chartex" xmlns:cx6="http://schemas.microsoft.com/office/drawing/2016/5/12/chartex" xmlns:cx7="http://schemas.microsoft.com/office/drawing/2016/5/13/chartex" xmlns:cx8="http://schemas.microsoft.com/office/drawing/2016/5/14/chartex" xmlns:mc="http://schemas.openxmlformats.org/markup-compatibility/2006" xmlns:aink="http://schemas.microsoft.com/office/drawing/2016/ink" xmlns:am3d="http://schemas.microsoft.com/office/drawing/2017/model3d" xmlns:o="urn:schemas-microsoft-com:office:office" xmlns:oel="http://schemas.microsoft.com/office/2019/extlst" xmlns:r="http://schemas.openxmlformats.org/officeDocument/2006/relationships" xmlns:m="http://schemas.openxmlformats.org/officeDocument/2006/math" xmlns:v="urn:schemas-microsoft-com:vml" xmlns:wp14="http://schemas.microsoft.com/office/word/2010/wordprocessingDrawing" xmlns:wp="http://schemas.openxmlformats.org/drawingml/2006/wordprocessingDrawing" xmlns:w10="urn:schemas-microsoft-com:office:word" xmlns:w="http://schemas.openxmlformats.org/wordprocessingml/2006/main" xmlns:w14="http://schemas.microsoft.com/office/word/2010/wordml" xmlns:w15="http://schemas.microsoft.com/office/word/2012/wordml" xmlns:w16cex="http://schemas.microsoft.com/office/word/2018/wordml/cex" xmlns:w16cid="http://schemas.microsoft.com/office/word/2016/wordml/cid" xmlns:w16="http://schemas.microsoft.com/office/word/2018/wordml" xmlns:w16du="http://schemas.microsoft.com/office/word/2023/wordml/word16du" xmlns:w16sdtdh="http://schemas.microsoft.com/office/word/2020/wordml/sdtdatahash" xmlns:w16sdtfl="http://schemas.microsoft.com/office/word/2024/wordml/sdtformatlock" xmlns:w16se="http://schemas.microsoft.com/office/word/2015/wordml/symex" xmlns:wpg="http://schemas.microsoft.com/office/word/2010/wordprocessingGroup" xmlns:wpi="http://schemas.microsoft.com/office/word/2010/wordprocessingInk" xmlns:wne="http://schemas.microsoft.com/office/word/2006/wordml" xmlns:wps="http://schemas.microsoft.com/office/word/2010/wordprocessingShape" mc:Ignorable="w14 w15 w16se w16cid w16 w16cex w16sdtdh w16sdtfl w16du wp14">
+<w:document xmlns:wpc="http://schemas.microsoft.com/office/word/2010/wordprocessingCanvas" xmlns:cx="http://schemas.microsoft.com/office/drawing/2014/chartex" xmlns:cx1="http://schemas.microsoft.com/office/drawing/2015/9/8/chartex" xmlns:cx2="http://schemas.microsoft.com/office/drawing/2015/10/21/chartex" xmlns:cx3="http://schemas.microsoft.com/office/drawing/2016/5/9/chartex" xmlns:cx4="http://schemas.microsoft.com/office/drawing/2016/5/10/chartex" xmlns:cx5="http://schemas.microsoft.com/office/drawing/2016/5/11/chartex" xmlns:cx6="http://schemas.microsoft.com/office/drawing/2016/5/12/chartex" xmlns:cx7="http://schemas.microsoft.com/office/drawing/2016/5/13/chartex" xmlns:cx8="http://schemas.microsoft.com/office/drawing/2016/5/14/chartex" xmlns:mc="http://schemas.openxmlformats.org/markup-compatibility/2006" xmlns:aink="http://schemas.microsoft.com/office/drawing/2016/ink" xmlns:am3d="http://schemas.microsoft.com/office/drawing/2017/model3d" xmlns:o="urn:schemas-microsoft-com:office:office" xmlns:oel="http://schemas.microsoft.com/office/2019/extlst" xmlns:r="http://schemas.openxmlformats.org/officeDocument/2006/relationships" xmlns:m="http://schemas.openxmlformats.org/officeDocument/2006/math" xmlns:v="urn:schemas-microsoft-com:vml" xmlns:wp14="http://schemas.microsoft.com/office/word/2010/wordprocessingDrawing" xmlns:wp="http://schemas.openxmlformats.org/drawingml/2006/wordprocessingDrawing" xmlns:w10="urn:schemas-microsoft-com:office:word" xmlns:w="http://schemas.openxmlformats.org/wordprocessingml/2006/main" xmlns:w14="http://schemas.microsoft.com/office/word/2010/wordml" xmlns:w15="http://schemas.microsoft.com/office/word/2012/wordml" xmlns:w16cei="http://schemas.microsoft.com/office/word/2026/wordml/cei" xmlns:w16cex="http://schemas.microsoft.com/office/word/2018/wordml/cex" xmlns:w16cid="http://schemas.microsoft.com/office/word/2016/wordml/cid" xmlns:w16="http://schemas.microsoft.com/office/word/2018/wordml" xmlns:w16du="http://schemas.microsoft.com/office/word/2023/wordml/word16du" xmlns:w16sdtdh="http://schemas.microsoft.com/office/word/2020/wordml/sdtdatahash" xmlns:w16sdtfl="http://schemas.microsoft.com/office/word/2024/wordml/sdtformatlock" xmlns:w16se="http://schemas.microsoft.com/office/word/2015/wordml/symex" xmlns:wpg="http://schemas.microsoft.com/office/word/2010/wordprocessingGroup" xmlns:wpi="http://schemas.microsoft.com/office/word/2010/wordprocessingInk" xmlns:wne="http://schemas.microsoft.com/office/word/2006/wordml" xmlns:wps="http://schemas.microsoft.com/office/word/2010/wordprocessingShape" mc:Ignorable="w14 w15 w16se w16cid w16 w16cex w16sdtdh w16sdtfl w16du wp14">
   <w:body>
     <w:p>
       <w:pPr>
         <w:pStyle w:val="Title"/>
         <w:jc w:val="center"/>
       </w:pPr>
+    </w:p>
+    <w:p>
+      <w:pPr>
+        <w:pStyle w:val="Title"/>
+        <w:jc w:val="center"/>
+      </w:pPr>
+    </w:p>
+    <w:p>
+      <w:pPr>
+        <w:pStyle w:val="Title"/>
+        <w:jc w:val="center"/>
+      </w:pPr>
+    </w:p>
+    <w:p>
+      <w:pPr>
+        <w:pStyle w:val="Title"/>
+        <w:jc w:val="center"/>
+      </w:pPr>
+    </w:p>
+    <w:p>
+      <w:pPr>
+        <w:pStyle w:val="Title"/>
+        <w:jc w:val="center"/>
+      </w:pPr>
+    </w:p>
+    <w:p>
+      <w:pPr>
+        <w:pStyle w:val="Title"/>
+        <w:jc w:val="center"/>
+      </w:pPr>
+    </w:p>
+    <w:p>
+      <w:pPr>
+        <w:pStyle w:val="Title"/>
+        <w:jc w:val="center"/>
+      </w:pPr>
+    </w:p>
+    <w:p>
+      <w:pPr>
+        <w:pStyle w:val="Title"/>
+        <w:jc w:val="center"/>
+      </w:pPr>
+    </w:p>
+    <w:p>
+      <w:pPr>
+        <w:pStyle w:val="Title"/>
+        <w:jc w:val="center"/>
+      </w:pPr>
       <w:r>
         <w:t>Ethereum Fundamentals</w:t>
       </w:r>
@@ -24,36 +72,871 @@
     </w:p>
     <w:p>
       <w:pPr>
-        <w:pStyle w:val="Heading1"/>
-      </w:pPr>
-      <w:r>
-        <w:t>Accounts</w:t>
-      </w:r>
-    </w:p>
-    <w:p>
-      <w:pPr>
-        <w:rPr>
+        <w:rPr>
+          <w:rFonts w:asciiTheme="majorBidi" w:eastAsiaTheme="majorEastAsia" w:hAnsiTheme="majorBidi"/>
+          <w:sz w:val="40"/>
+          <w:szCs w:val="40"/>
+        </w:rPr>
+      </w:pPr>
+      <w:r>
+        <w:br w:type="page"/>
+      </w:r>
+    </w:p>
+    <w:sdt>
+      <w:sdtPr>
+        <w:id w:val="576176701"/>
+        <w:docPartObj>
+          <w:docPartGallery w:val="Table of Contents"/>
+          <w:docPartUnique/>
+        </w:docPartObj>
+      </w:sdtPr>
+      <w:sdtEndPr>
+        <w:rPr>
+          <w:rFonts w:ascii="Times New Roman" w:eastAsiaTheme="minorHAnsi" w:hAnsi="Times New Roman"/>
           <w:b/>
           <w:bCs/>
-        </w:rPr>
-      </w:pPr>
-      <w:r>
+          <w:noProof/>
+          <w:color w:val="auto"/>
+          <w:kern w:val="2"/>
+          <w:sz w:val="24"/>
+          <w:szCs w:val="24"/>
+          <w14:ligatures w14:val="standardContextual"/>
+        </w:rPr>
+      </w:sdtEndPr>
+      <w:sdtContent>
+        <w:p>
+          <w:pPr>
+            <w:pStyle w:val="TOCHeading"/>
+            <w:rPr>
+              <w:rFonts w:asciiTheme="majorBidi" w:hAnsiTheme="majorBidi"/>
+              <w:color w:val="auto"/>
+            </w:rPr>
+          </w:pPr>
+          <w:r>
+            <w:rPr>
+              <w:rFonts w:asciiTheme="majorBidi" w:hAnsiTheme="majorBidi"/>
+              <w:color w:val="auto"/>
+            </w:rPr>
+            <w:t>Contents</w:t>
+          </w:r>
+        </w:p>
+        <w:p>
+          <w:pPr>
+            <w:pStyle w:val="TOC1"/>
+            <w:tabs>
+              <w:tab w:val="right" w:leader="dot" w:pos="9350"/>
+            </w:tabs>
+            <w:rPr>
+              <w:noProof/>
+            </w:rPr>
+          </w:pPr>
+          <w:r>
+            <w:fldChar w:fldCharType="begin"/>
+          </w:r>
+          <w:r>
+            <w:instrText xml:space="preserve"> TOC \o "1-3" \h \z \u </w:instrText>
+          </w:r>
+          <w:r>
+            <w:fldChar w:fldCharType="separate"/>
+          </w:r>
+          <w:hyperlink w:anchor="_Toc236848946" w:history="1">
+            <w:r>
+              <w:rPr>
+                <w:rStyle w:val="Hyperlink"/>
+                <w:noProof/>
+              </w:rPr>
+              <w:t>Accounts</w:t>
+            </w:r>
+            <w:r>
+              <w:rPr>
+                <w:noProof/>
+                <w:webHidden/>
+              </w:rPr>
+              <w:tab/>
+            </w:r>
+            <w:r>
+              <w:rPr>
+                <w:noProof/>
+                <w:webHidden/>
+              </w:rPr>
+              <w:fldChar w:fldCharType="begin"/>
+            </w:r>
+            <w:r>
+              <w:rPr>
+                <w:noProof/>
+                <w:webHidden/>
+              </w:rPr>
+              <w:instrText xml:space="preserve"> PAGEREF _Toc236848946 \h </w:instrText>
+            </w:r>
+            <w:r>
+              <w:rPr>
+                <w:noProof/>
+                <w:webHidden/>
+              </w:rPr>
+            </w:r>
+            <w:r>
+              <w:rPr>
+                <w:noProof/>
+                <w:webHidden/>
+              </w:rPr>
+              <w:fldChar w:fldCharType="separate"/>
+            </w:r>
+            <w:r>
+              <w:rPr>
+                <w:noProof/>
+                <w:webHidden/>
+              </w:rPr>
+              <w:t>3</w:t>
+            </w:r>
+            <w:r>
+              <w:rPr>
+                <w:noProof/>
+                <w:webHidden/>
+              </w:rPr>
+              <w:fldChar w:fldCharType="end"/>
+            </w:r>
+          </w:hyperlink>
+        </w:p>
+        <w:p>
+          <w:pPr>
+            <w:pStyle w:val="TOC1"/>
+            <w:tabs>
+              <w:tab w:val="right" w:leader="dot" w:pos="9350"/>
+            </w:tabs>
+            <w:rPr>
+              <w:noProof/>
+            </w:rPr>
+          </w:pPr>
+          <w:hyperlink w:anchor="_Toc236848947" w:history="1">
+            <w:r>
+              <w:rPr>
+                <w:rStyle w:val="Hyperlink"/>
+                <w:noProof/>
+              </w:rPr>
+              <w:t>Transactions</w:t>
+            </w:r>
+            <w:r>
+              <w:rPr>
+                <w:noProof/>
+                <w:webHidden/>
+              </w:rPr>
+              <w:tab/>
+            </w:r>
+            <w:r>
+              <w:rPr>
+                <w:noProof/>
+                <w:webHidden/>
+              </w:rPr>
+              <w:fldChar w:fldCharType="begin"/>
+            </w:r>
+            <w:r>
+              <w:rPr>
+                <w:noProof/>
+                <w:webHidden/>
+              </w:rPr>
+              <w:instrText xml:space="preserve"> PAGEREF _Toc236848947 \h </w:instrText>
+            </w:r>
+            <w:r>
+              <w:rPr>
+                <w:noProof/>
+                <w:webHidden/>
+              </w:rPr>
+            </w:r>
+            <w:r>
+              <w:rPr>
+                <w:noProof/>
+                <w:webHidden/>
+              </w:rPr>
+              <w:fldChar w:fldCharType="separate"/>
+            </w:r>
+            <w:r>
+              <w:rPr>
+                <w:noProof/>
+                <w:webHidden/>
+              </w:rPr>
+              <w:t>4</w:t>
+            </w:r>
+            <w:r>
+              <w:rPr>
+                <w:noProof/>
+                <w:webHidden/>
+              </w:rPr>
+              <w:fldChar w:fldCharType="end"/>
+            </w:r>
+          </w:hyperlink>
+        </w:p>
+        <w:p>
+          <w:pPr>
+            <w:pStyle w:val="TOC2"/>
+            <w:tabs>
+              <w:tab w:val="right" w:leader="dot" w:pos="9350"/>
+            </w:tabs>
+            <w:rPr>
+              <w:noProof/>
+            </w:rPr>
+          </w:pPr>
+          <w:hyperlink w:anchor="_Toc236848948" w:history="1">
+            <w:r>
+              <w:rPr>
+                <w:rStyle w:val="Hyperlink"/>
+                <w:noProof/>
+              </w:rPr>
+              <w:t>Types of transactions</w:t>
+            </w:r>
+            <w:r>
+              <w:rPr>
+                <w:noProof/>
+                <w:webHidden/>
+              </w:rPr>
+              <w:tab/>
+            </w:r>
+            <w:r>
+              <w:rPr>
+                <w:noProof/>
+                <w:webHidden/>
+              </w:rPr>
+              <w:fldChar w:fldCharType="begin"/>
+            </w:r>
+            <w:r>
+              <w:rPr>
+                <w:noProof/>
+                <w:webHidden/>
+              </w:rPr>
+              <w:instrText xml:space="preserve"> PAGEREF _Toc236848948 \h </w:instrText>
+            </w:r>
+            <w:r>
+              <w:rPr>
+                <w:noProof/>
+                <w:webHidden/>
+              </w:rPr>
+            </w:r>
+            <w:r>
+              <w:rPr>
+                <w:noProof/>
+                <w:webHidden/>
+              </w:rPr>
+              <w:fldChar w:fldCharType="separate"/>
+            </w:r>
+            <w:r>
+              <w:rPr>
+                <w:noProof/>
+                <w:webHidden/>
+              </w:rPr>
+              <w:t>5</w:t>
+            </w:r>
+            <w:r>
+              <w:rPr>
+                <w:noProof/>
+                <w:webHidden/>
+              </w:rPr>
+              <w:fldChar w:fldCharType="end"/>
+            </w:r>
+          </w:hyperlink>
+        </w:p>
+        <w:p>
+          <w:pPr>
+            <w:pStyle w:val="TOC1"/>
+            <w:tabs>
+              <w:tab w:val="right" w:leader="dot" w:pos="9350"/>
+            </w:tabs>
+            <w:rPr>
+              <w:noProof/>
+            </w:rPr>
+          </w:pPr>
+          <w:hyperlink w:anchor="_Toc236848949" w:history="1">
+            <w:r>
+              <w:rPr>
+                <w:rStyle w:val="Hyperlink"/>
+                <w:noProof/>
+              </w:rPr>
+              <w:t>Blocks</w:t>
+            </w:r>
+            <w:r>
+              <w:rPr>
+                <w:noProof/>
+                <w:webHidden/>
+              </w:rPr>
+              <w:tab/>
+            </w:r>
+            <w:r>
+              <w:rPr>
+                <w:noProof/>
+                <w:webHidden/>
+              </w:rPr>
+              <w:fldChar w:fldCharType="begin"/>
+            </w:r>
+            <w:r>
+              <w:rPr>
+                <w:noProof/>
+                <w:webHidden/>
+              </w:rPr>
+              <w:instrText xml:space="preserve"> PAGEREF _Toc236848949 \h </w:instrText>
+            </w:r>
+            <w:r>
+              <w:rPr>
+                <w:noProof/>
+                <w:webHidden/>
+              </w:rPr>
+            </w:r>
+            <w:r>
+              <w:rPr>
+                <w:noProof/>
+                <w:webHidden/>
+              </w:rPr>
+              <w:fldChar w:fldCharType="separate"/>
+            </w:r>
+            <w:r>
+              <w:rPr>
+                <w:noProof/>
+                <w:webHidden/>
+              </w:rPr>
+              <w:t>5</w:t>
+            </w:r>
+            <w:r>
+              <w:rPr>
+                <w:noProof/>
+                <w:webHidden/>
+              </w:rPr>
+              <w:fldChar w:fldCharType="end"/>
+            </w:r>
+          </w:hyperlink>
+        </w:p>
+        <w:p>
+          <w:pPr>
+            <w:pStyle w:val="TOC2"/>
+            <w:tabs>
+              <w:tab w:val="right" w:leader="dot" w:pos="9350"/>
+            </w:tabs>
+            <w:rPr>
+              <w:noProof/>
+            </w:rPr>
+          </w:pPr>
+          <w:hyperlink w:anchor="_Toc236848950" w:history="1">
+            <w:r>
+              <w:rPr>
+                <w:rStyle w:val="Hyperlink"/>
+                <w:noProof/>
+              </w:rPr>
+              <w:t>Proof-of-stake protocol</w:t>
+            </w:r>
+            <w:r>
+              <w:rPr>
+                <w:noProof/>
+                <w:webHidden/>
+              </w:rPr>
+              <w:tab/>
+            </w:r>
+            <w:r>
+              <w:rPr>
+                <w:noProof/>
+                <w:webHidden/>
+              </w:rPr>
+              <w:fldChar w:fldCharType="begin"/>
+            </w:r>
+            <w:r>
+              <w:rPr>
+                <w:noProof/>
+                <w:webHidden/>
+              </w:rPr>
+              <w:instrText xml:space="preserve"> PAGEREF _Toc236848950 \h </w:instrText>
+            </w:r>
+            <w:r>
+              <w:rPr>
+                <w:noProof/>
+                <w:webHidden/>
+              </w:rPr>
+            </w:r>
+            <w:r>
+              <w:rPr>
+                <w:noProof/>
+                <w:webHidden/>
+              </w:rPr>
+              <w:fldChar w:fldCharType="separate"/>
+            </w:r>
+            <w:r>
+              <w:rPr>
+                <w:noProof/>
+                <w:webHidden/>
+              </w:rPr>
+              <w:t>5</w:t>
+            </w:r>
+            <w:r>
+              <w:rPr>
+                <w:noProof/>
+                <w:webHidden/>
+              </w:rPr>
+              <w:fldChar w:fldCharType="end"/>
+            </w:r>
+          </w:hyperlink>
+        </w:p>
+        <w:p>
+          <w:pPr>
+            <w:pStyle w:val="TOC2"/>
+            <w:tabs>
+              <w:tab w:val="right" w:leader="dot" w:pos="9350"/>
+            </w:tabs>
+            <w:rPr>
+              <w:noProof/>
+            </w:rPr>
+          </w:pPr>
+          <w:hyperlink w:anchor="_Toc236848951" w:history="1">
+            <w:r>
+              <w:rPr>
+                <w:rStyle w:val="Hyperlink"/>
+                <w:noProof/>
+              </w:rPr>
+              <w:t>Block time</w:t>
+            </w:r>
+            <w:r>
+              <w:rPr>
+                <w:noProof/>
+                <w:webHidden/>
+              </w:rPr>
+              <w:tab/>
+            </w:r>
+            <w:r>
+              <w:rPr>
+                <w:noProof/>
+                <w:webHidden/>
+              </w:rPr>
+              <w:fldChar w:fldCharType="begin"/>
+            </w:r>
+            <w:r>
+              <w:rPr>
+                <w:noProof/>
+                <w:webHidden/>
+              </w:rPr>
+              <w:instrText xml:space="preserve"> PAGEREF _Toc236848951 \h </w:instrText>
+            </w:r>
+            <w:r>
+              <w:rPr>
+                <w:noProof/>
+                <w:webHidden/>
+              </w:rPr>
+            </w:r>
+            <w:r>
+              <w:rPr>
+                <w:noProof/>
+                <w:webHidden/>
+              </w:rPr>
+              <w:fldChar w:fldCharType="separate"/>
+            </w:r>
+            <w:r>
+              <w:rPr>
+                <w:noProof/>
+                <w:webHidden/>
+              </w:rPr>
+              <w:t>6</w:t>
+            </w:r>
+            <w:r>
+              <w:rPr>
+                <w:noProof/>
+                <w:webHidden/>
+              </w:rPr>
+              <w:fldChar w:fldCharType="end"/>
+            </w:r>
+          </w:hyperlink>
+        </w:p>
+        <w:p>
+          <w:pPr>
+            <w:pStyle w:val="TOC1"/>
+            <w:tabs>
+              <w:tab w:val="right" w:leader="dot" w:pos="9350"/>
+            </w:tabs>
+            <w:rPr>
+              <w:noProof/>
+            </w:rPr>
+          </w:pPr>
+          <w:hyperlink w:anchor="_Toc236848952" w:history="1">
+            <w:r>
+              <w:rPr>
+                <w:rStyle w:val="Hyperlink"/>
+                <w:noProof/>
+              </w:rPr>
+              <w:t>Ethereum Virtual Machine (EVM)</w:t>
+            </w:r>
+            <w:r>
+              <w:rPr>
+                <w:noProof/>
+                <w:webHidden/>
+              </w:rPr>
+              <w:tab/>
+            </w:r>
+            <w:r>
+              <w:rPr>
+                <w:noProof/>
+                <w:webHidden/>
+              </w:rPr>
+              <w:fldChar w:fldCharType="begin"/>
+            </w:r>
+            <w:r>
+              <w:rPr>
+                <w:noProof/>
+                <w:webHidden/>
+              </w:rPr>
+              <w:instrText xml:space="preserve"> PAGEREF _Toc236848952 \h </w:instrText>
+            </w:r>
+            <w:r>
+              <w:rPr>
+                <w:noProof/>
+                <w:webHidden/>
+              </w:rPr>
+            </w:r>
+            <w:r>
+              <w:rPr>
+                <w:noProof/>
+                <w:webHidden/>
+              </w:rPr>
+              <w:fldChar w:fldCharType="separate"/>
+            </w:r>
+            <w:r>
+              <w:rPr>
+                <w:noProof/>
+                <w:webHidden/>
+              </w:rPr>
+              <w:t>6</w:t>
+            </w:r>
+            <w:r>
+              <w:rPr>
+                <w:noProof/>
+                <w:webHidden/>
+              </w:rPr>
+              <w:fldChar w:fldCharType="end"/>
+            </w:r>
+          </w:hyperlink>
+        </w:p>
+        <w:p>
+          <w:pPr>
+            <w:pStyle w:val="TOC2"/>
+            <w:tabs>
+              <w:tab w:val="right" w:leader="dot" w:pos="9350"/>
+            </w:tabs>
+            <w:rPr>
+              <w:noProof/>
+            </w:rPr>
+          </w:pPr>
+          <w:hyperlink w:anchor="_Toc236848953" w:history="1">
+            <w:r>
+              <w:rPr>
+                <w:rStyle w:val="Hyperlink"/>
+                <w:noProof/>
+              </w:rPr>
+              <w:t>EVM instructions</w:t>
+            </w:r>
+            <w:r>
+              <w:rPr>
+                <w:noProof/>
+                <w:webHidden/>
+              </w:rPr>
+              <w:tab/>
+            </w:r>
+            <w:r>
+              <w:rPr>
+                <w:noProof/>
+                <w:webHidden/>
+              </w:rPr>
+              <w:fldChar w:fldCharType="begin"/>
+            </w:r>
+            <w:r>
+              <w:rPr>
+                <w:noProof/>
+                <w:webHidden/>
+              </w:rPr>
+              <w:instrText xml:space="preserve"> PAGEREF _Toc236848953 \h </w:instrText>
+            </w:r>
+            <w:r>
+              <w:rPr>
+                <w:noProof/>
+                <w:webHidden/>
+              </w:rPr>
+            </w:r>
+            <w:r>
+              <w:rPr>
+                <w:noProof/>
+                <w:webHidden/>
+              </w:rPr>
+              <w:fldChar w:fldCharType="separate"/>
+            </w:r>
+            <w:r>
+              <w:rPr>
+                <w:noProof/>
+                <w:webHidden/>
+              </w:rPr>
+              <w:t>7</w:t>
+            </w:r>
+            <w:r>
+              <w:rPr>
+                <w:noProof/>
+                <w:webHidden/>
+              </w:rPr>
+              <w:fldChar w:fldCharType="end"/>
+            </w:r>
+          </w:hyperlink>
+        </w:p>
+        <w:p>
+          <w:pPr>
+            <w:pStyle w:val="TOC2"/>
+            <w:tabs>
+              <w:tab w:val="right" w:leader="dot" w:pos="9350"/>
+            </w:tabs>
+            <w:rPr>
+              <w:noProof/>
+            </w:rPr>
+          </w:pPr>
+          <w:hyperlink w:anchor="_Toc236848954" w:history="1">
+            <w:r>
+              <w:rPr>
+                <w:rStyle w:val="Hyperlink"/>
+                <w:noProof/>
+              </w:rPr>
+              <w:t>Transient storage</w:t>
+            </w:r>
+            <w:r>
+              <w:rPr>
+                <w:noProof/>
+                <w:webHidden/>
+              </w:rPr>
+              <w:tab/>
+            </w:r>
+            <w:r>
+              <w:rPr>
+                <w:noProof/>
+                <w:webHidden/>
+              </w:rPr>
+              <w:fldChar w:fldCharType="begin"/>
+            </w:r>
+            <w:r>
+              <w:rPr>
+                <w:noProof/>
+                <w:webHidden/>
+              </w:rPr>
+              <w:instrText xml:space="preserve"> PAGEREF _Toc236848954 \h </w:instrText>
+            </w:r>
+            <w:r>
+              <w:rPr>
+                <w:noProof/>
+                <w:webHidden/>
+              </w:rPr>
+            </w:r>
+            <w:r>
+              <w:rPr>
+                <w:noProof/>
+                <w:webHidden/>
+              </w:rPr>
+              <w:fldChar w:fldCharType="separate"/>
+            </w:r>
+            <w:r>
+              <w:rPr>
+                <w:noProof/>
+                <w:webHidden/>
+              </w:rPr>
+              <w:t>7</w:t>
+            </w:r>
+            <w:r>
+              <w:rPr>
+                <w:noProof/>
+                <w:webHidden/>
+              </w:rPr>
+              <w:fldChar w:fldCharType="end"/>
+            </w:r>
+          </w:hyperlink>
+        </w:p>
+        <w:p>
+          <w:pPr>
+            <w:pStyle w:val="TOC1"/>
+            <w:tabs>
+              <w:tab w:val="right" w:leader="dot" w:pos="9350"/>
+            </w:tabs>
+            <w:rPr>
+              <w:noProof/>
+            </w:rPr>
+          </w:pPr>
+          <w:hyperlink w:anchor="_Toc236848955" w:history="1">
+            <w:r>
+              <w:rPr>
+                <w:rStyle w:val="Hyperlink"/>
+                <w:noProof/>
+              </w:rPr>
+              <w:t>Gas and fees</w:t>
+            </w:r>
+            <w:r>
+              <w:rPr>
+                <w:noProof/>
+                <w:webHidden/>
+              </w:rPr>
+              <w:tab/>
+            </w:r>
+            <w:r>
+              <w:rPr>
+                <w:noProof/>
+                <w:webHidden/>
+              </w:rPr>
+              <w:fldChar w:fldCharType="begin"/>
+            </w:r>
+            <w:r>
+              <w:rPr>
+                <w:noProof/>
+                <w:webHidden/>
+              </w:rPr>
+              <w:instrText xml:space="preserve"> PAGEREF _Toc236848955 \h </w:instrText>
+            </w:r>
+            <w:r>
+              <w:rPr>
+                <w:noProof/>
+                <w:webHidden/>
+              </w:rPr>
+            </w:r>
+            <w:r>
+              <w:rPr>
+                <w:noProof/>
+                <w:webHidden/>
+              </w:rPr>
+              <w:fldChar w:fldCharType="separate"/>
+            </w:r>
+            <w:r>
+              <w:rPr>
+                <w:noProof/>
+                <w:webHidden/>
+              </w:rPr>
+              <w:t>8</w:t>
+            </w:r>
+            <w:r>
+              <w:rPr>
+                <w:noProof/>
+                <w:webHidden/>
+              </w:rPr>
+              <w:fldChar w:fldCharType="end"/>
+            </w:r>
+          </w:hyperlink>
+        </w:p>
+        <w:p>
+          <w:pPr>
+            <w:pStyle w:val="TOC1"/>
+            <w:tabs>
+              <w:tab w:val="right" w:leader="dot" w:pos="9350"/>
+            </w:tabs>
+            <w:rPr>
+              <w:noProof/>
+            </w:rPr>
+          </w:pPr>
+          <w:hyperlink w:anchor="_Toc236848956" w:history="1">
+            <w:r>
+              <w:rPr>
+                <w:rStyle w:val="Hyperlink"/>
+                <w:noProof/>
+              </w:rPr>
+              <w:t>Events and logs</w:t>
+            </w:r>
+            <w:r>
+              <w:rPr>
+                <w:noProof/>
+                <w:webHidden/>
+              </w:rPr>
+              <w:tab/>
+            </w:r>
+            <w:r>
+              <w:rPr>
+                <w:noProof/>
+                <w:webHidden/>
+              </w:rPr>
+              <w:fldChar w:fldCharType="begin"/>
+            </w:r>
+            <w:r>
+              <w:rPr>
+                <w:noProof/>
+                <w:webHidden/>
+              </w:rPr>
+              <w:instrText xml:space="preserve"> PAGEREF _Toc236848956 \h </w:instrText>
+            </w:r>
+            <w:r>
+              <w:rPr>
+                <w:noProof/>
+                <w:webHidden/>
+              </w:rPr>
+            </w:r>
+            <w:r>
+              <w:rPr>
+                <w:noProof/>
+                <w:webHidden/>
+              </w:rPr>
+              <w:fldChar w:fldCharType="separate"/>
+            </w:r>
+            <w:r>
+              <w:rPr>
+                <w:noProof/>
+                <w:webHidden/>
+              </w:rPr>
+              <w:t>10</w:t>
+            </w:r>
+            <w:r>
+              <w:rPr>
+                <w:noProof/>
+                <w:webHidden/>
+              </w:rPr>
+              <w:fldChar w:fldCharType="end"/>
+            </w:r>
+          </w:hyperlink>
+        </w:p>
+        <w:p>
+          <w:r>
+            <w:rPr>
+              <w:b/>
+              <w:bCs/>
+              <w:noProof/>
+            </w:rPr>
+            <w:fldChar w:fldCharType="end"/>
+          </w:r>
+        </w:p>
+      </w:sdtContent>
+    </w:sdt>
+    <w:p>
+      <w:pPr>
+        <w:rPr>
+          <w:rFonts w:asciiTheme="majorBidi" w:eastAsiaTheme="majorEastAsia" w:hAnsiTheme="majorBidi"/>
+          <w:sz w:val="40"/>
+          <w:szCs w:val="40"/>
+        </w:rPr>
+      </w:pPr>
+    </w:p>
+    <w:p>
+      <w:pPr>
+        <w:rPr>
+          <w:rFonts w:asciiTheme="majorBidi" w:eastAsiaTheme="majorEastAsia" w:hAnsiTheme="majorBidi"/>
+          <w:sz w:val="40"/>
+          <w:szCs w:val="40"/>
+        </w:rPr>
+      </w:pPr>
+      <w:bookmarkStart w:id="0" w:name="_Toc236848946"/>
+      <w:r>
+        <w:br w:type="page"/>
+      </w:r>
+    </w:p>
+    <w:p>
+      <w:pPr>
+        <w:pStyle w:val="Heading1"/>
+      </w:pPr>
+      <w:r>
+        <w:lastRenderedPageBreak/>
+        <w:t>Accounts</w:t>
+      </w:r>
+      <w:bookmarkEnd w:id="0"/>
+    </w:p>
+    <w:p>
+      <w:pPr>
         <w:rPr>
           <w:b/>
           <w:bCs/>
         </w:rPr>
+      </w:pPr>
+      <w:r>
+        <w:rPr>
+          <w:b/>
+          <w:bCs/>
+        </w:rPr>
         <w:t>Isolated</w:t>
       </w:r>
       <w:r>
-        <w:t xml:space="preserve"> - </w:t>
-      </w:r>
-      <w:proofErr w:type="spellStart"/>
-      <w:r>
-        <w:t>dapps</w:t>
-      </w:r>
-      <w:proofErr w:type="spellEnd"/>
-      <w:r>
-        <w:t xml:space="preserve"> are executed in a virtual environment known as Ethereum Virtual Machine so that </w:t>
+        <w:t xml:space="preserve"> - dapps are executed in a virtual environment known as Ethereum Virtual Machine so that </w:t>
       </w:r>
       <w:r>
         <w:rPr>
@@ -226,7 +1109,6 @@
           <w:b/>
           <w:bCs/>
         </w:rPr>
-        <w:lastRenderedPageBreak/>
         <w:t>nonce</w:t>
       </w:r>
       <w:r>
@@ -245,32 +1127,23 @@
         <w:t>balance</w:t>
       </w:r>
       <w:r>
-        <w:t xml:space="preserve"> – The number of </w:t>
-      </w:r>
-      <w:proofErr w:type="spellStart"/>
-      <w:r>
-        <w:t>wei</w:t>
-      </w:r>
-      <w:proofErr w:type="spellEnd"/>
-      <w:r>
-        <w:t xml:space="preserve"> owned by this address.</w:t>
-      </w:r>
-    </w:p>
-    <w:p>
-      <w:pPr>
-        <w:rPr>
-          <w:color w:val="6600FF"/>
-        </w:rPr>
-      </w:pPr>
-      <w:proofErr w:type="spellStart"/>
+        <w:t xml:space="preserve"> – The number of wei owned by this address.</w:t>
+      </w:r>
+    </w:p>
+    <w:p>
+      <w:pPr>
+        <w:rPr>
+          <w:color w:val="6600FF"/>
+        </w:rPr>
+      </w:pPr>
       <w:r>
         <w:rPr>
           <w:b/>
           <w:bCs/>
         </w:rPr>
+        <w:lastRenderedPageBreak/>
         <w:t>codeHash</w:t>
       </w:r>
-      <w:proofErr w:type="spellEnd"/>
       <w:r>
         <w:t xml:space="preserve"> – This hash refers to the </w:t>
       </w:r>
@@ -297,13 +1170,8 @@
         <w:t xml:space="preserve">It cannot be changed, unlike the other account fields. </w:t>
       </w:r>
       <w:r>
-        <w:t xml:space="preserve">All such code fragments are contained in the state database under their corresponding hashes for later retrieval. This hash value is known as a </w:t>
-      </w:r>
-      <w:proofErr w:type="spellStart"/>
-      <w:r>
-        <w:t>codeHash</w:t>
-      </w:r>
-      <w:proofErr w:type="spellEnd"/>
+        <w:t>All such code fragments are contained in the state database under their corresponding hashes for later retrieval. This hash value is known as a codeHash</w:t>
+      </w:r>
       <w:r>
         <w:rPr>
           <w:color w:val="0000FF"/>
@@ -314,25 +1182,10 @@
         <w:rPr>
           <w:color w:val="6600FF"/>
         </w:rPr>
-        <w:t xml:space="preserve">For externally owned accounts, the </w:t>
-      </w:r>
-      <w:proofErr w:type="spellStart"/>
-      <w:r>
-        <w:rPr>
-          <w:color w:val="6600FF"/>
-        </w:rPr>
-        <w:t>codeHash</w:t>
-      </w:r>
-      <w:proofErr w:type="spellEnd"/>
-      <w:r>
-        <w:rPr>
-          <w:color w:val="6600FF"/>
-        </w:rPr>
-        <w:t xml:space="preserve"> field is the hash of an empty string.</w:t>
-      </w:r>
-    </w:p>
-    <w:p>
-      <w:proofErr w:type="spellStart"/>
+        <w:t>For externally owned accounts, the codeHash field is the hash of an empty string.</w:t>
+      </w:r>
+    </w:p>
+    <w:p>
       <w:r>
         <w:rPr>
           <w:b/>
@@ -340,7 +1193,6 @@
         </w:rPr>
         <w:t>storageRoot</w:t>
       </w:r>
-      <w:proofErr w:type="spellEnd"/>
       <w:r>
         <w:t xml:space="preserve"> – Sometimes known as a storage hash. A 256-bit hash of the root node of a </w:t>
       </w:r>
@@ -360,15 +1212,7 @@
         <w:t>.</w:t>
       </w:r>
       <w:r>
-        <w:t xml:space="preserve"> This </w:t>
-      </w:r>
-      <w:proofErr w:type="spellStart"/>
-      <w:r>
-        <w:t>trie</w:t>
-      </w:r>
-      <w:proofErr w:type="spellEnd"/>
-      <w:r>
-        <w:t xml:space="preserve"> encodes the hash of the storage contents of this account, and is empty by default.</w:t>
+        <w:t xml:space="preserve"> This trie encodes the hash of the storage contents of this account, and is empty by default.</w:t>
       </w:r>
     </w:p>
     <w:p>
@@ -425,9 +1269,11 @@
       <w:pPr>
         <w:pStyle w:val="Heading1"/>
       </w:pPr>
+      <w:bookmarkStart w:id="1" w:name="_Toc236848947"/>
       <w:r>
         <w:t>Transactions</w:t>
       </w:r>
+      <w:bookmarkEnd w:id="1"/>
     </w:p>
     <w:p>
       <w:r>
@@ -458,7 +1304,7 @@
           <w:noProof/>
         </w:rPr>
         <w:drawing>
-          <wp:inline distT="0" distB="0" distL="0" distR="0" wp14:anchorId="7AB712C8" wp14:editId="16B5B57D">
+          <wp:inline distT="0" distB="0" distL="0" distR="0" wp14:anchorId="7AB712C8" wp14:editId="603BE021">
             <wp:extent cx="5938520" cy="1579880"/>
             <wp:effectExtent l="0" t="0" r="5080" b="1270"/>
             <wp:docPr id="1822397795" name="Picture 5"/>
@@ -520,7 +1366,6 @@
         </w:numPr>
       </w:pPr>
       <w:r>
-        <w:lastRenderedPageBreak/>
         <w:t>from – the address of the sender, that will be signing the transaction. This will be an externally-owned account as contract accounts cannot send transactions</w:t>
       </w:r>
     </w:p>
@@ -555,6 +1400,7 @@
         </w:rPr>
       </w:pPr>
       <w:r>
+        <w:lastRenderedPageBreak/>
         <w:t xml:space="preserve">signature – </w:t>
       </w:r>
       <w:r>
@@ -604,13 +1450,8 @@
           <w:numId w:val="3"/>
         </w:numPr>
       </w:pPr>
-      <w:proofErr w:type="spellStart"/>
-      <w:r>
-        <w:t>gasLimit</w:t>
-      </w:r>
-      <w:proofErr w:type="spellEnd"/>
-      <w:r>
-        <w:t xml:space="preserve"> – the maximum amount of gas units that can be consumed by the transaction. The </w:t>
+      <w:r>
+        <w:t xml:space="preserve">gasLimit – the maximum amount of gas units that can be consumed by the transaction. The </w:t>
       </w:r>
       <w:hyperlink r:id="rId11" w:history="1">
         <w:r>
@@ -631,13 +1472,8 @@
           <w:numId w:val="3"/>
         </w:numPr>
       </w:pPr>
-      <w:proofErr w:type="spellStart"/>
-      <w:r>
-        <w:t>maxPriorityFeePerGas</w:t>
-      </w:r>
-      <w:proofErr w:type="spellEnd"/>
-      <w:r>
-        <w:t xml:space="preserve"> - the maximum price of the consumed gas to be included as a tip to the validator</w:t>
+      <w:r>
+        <w:t>maxPriorityFeePerGas - the maximum price of the consumed gas to be included as a tip to the validator</w:t>
       </w:r>
     </w:p>
     <w:p>
@@ -647,29 +1483,8 @@
           <w:numId w:val="3"/>
         </w:numPr>
       </w:pPr>
-      <w:proofErr w:type="spellStart"/>
-      <w:r>
-        <w:t>maxFeePerGas</w:t>
-      </w:r>
-      <w:proofErr w:type="spellEnd"/>
-      <w:r>
-        <w:t xml:space="preserve"> - the maximum fee per unit of gas willing to be paid for the transaction (inclusive of </w:t>
-      </w:r>
-      <w:proofErr w:type="spellStart"/>
-      <w:r>
-        <w:t>baseFeePerGas</w:t>
-      </w:r>
-      <w:proofErr w:type="spellEnd"/>
-      <w:r>
-        <w:t xml:space="preserve"> and </w:t>
-      </w:r>
-      <w:proofErr w:type="spellStart"/>
-      <w:r>
-        <w:t>maxPriorityFeePerGas</w:t>
-      </w:r>
-      <w:proofErr w:type="spellEnd"/>
-      <w:r>
-        <w:t>)</w:t>
+      <w:r>
+        <w:t>maxFeePerGas - the maximum fee per unit of gas willing to be paid for the transaction (inclusive of baseFeePerGas and maxPriorityFeePerGas)</w:t>
       </w:r>
     </w:p>
     <w:p/>
@@ -677,9 +1492,11 @@
       <w:pPr>
         <w:pStyle w:val="Heading2"/>
       </w:pPr>
+      <w:bookmarkStart w:id="2" w:name="_Toc236848948"/>
       <w:r>
         <w:t>Types of transactions</w:t>
       </w:r>
+      <w:bookmarkEnd w:id="2"/>
     </w:p>
     <w:p>
       <w:r>
@@ -720,17 +1537,8 @@
         <w:t>a transaction without a 'to' address, where the data field is used for the contract code.</w:t>
       </w:r>
       <w:r>
-        <w:t xml:space="preserve"> (if we check this in Remix the </w:t>
-      </w:r>
-      <w:proofErr w:type="spellStart"/>
-      <w:r>
-        <w:t>to</w:t>
-      </w:r>
-      <w:proofErr w:type="spellEnd"/>
-      <w:r>
-        <w:t xml:space="preserve"> is: </w:t>
-      </w:r>
-      <w:proofErr w:type="spellStart"/>
+        <w:t xml:space="preserve"> (if we check this in Remix the to is: </w:t>
+      </w:r>
       <w:r>
         <w:rPr>
           <w:rStyle w:val="codesnippetChar"/>
@@ -753,14 +1561,7 @@
         <w:rPr>
           <w:rStyle w:val="codesnippetChar"/>
         </w:rPr>
-        <w:t>ame.constructor</w:t>
-      </w:r>
-      <w:proofErr w:type="spellEnd"/>
-      <w:r>
-        <w:rPr>
-          <w:rStyle w:val="codesnippetChar"/>
-        </w:rPr>
-        <w:t>()</w:t>
+        <w:t>ame.constructor()</w:t>
       </w:r>
       <w:r>
         <w:t>)</w:t>
@@ -786,17 +1587,8 @@
         <w:t xml:space="preserve"> </w:t>
       </w:r>
       <w:r>
-        <w:t xml:space="preserve">(if we check this in Remix the </w:t>
-      </w:r>
-      <w:proofErr w:type="spellStart"/>
-      <w:r>
-        <w:t>to</w:t>
-      </w:r>
-      <w:proofErr w:type="spellEnd"/>
-      <w:r>
-        <w:t xml:space="preserve"> is: </w:t>
-      </w:r>
-      <w:proofErr w:type="spellStart"/>
+        <w:t xml:space="preserve">(if we check this in Remix the to is: </w:t>
+      </w:r>
       <w:r>
         <w:rPr>
           <w:rStyle w:val="codesnippetChar"/>
@@ -827,7 +1619,6 @@
         </w:rPr>
         <w:t>function</w:t>
       </w:r>
-      <w:proofErr w:type="spellEnd"/>
       <w:r>
         <w:rPr>
           <w:rStyle w:val="codesnippetChar"/>
@@ -842,9 +1633,11 @@
       <w:pPr>
         <w:pStyle w:val="Heading1"/>
       </w:pPr>
+      <w:bookmarkStart w:id="3" w:name="_Toc236848949"/>
       <w:r>
         <w:t>Blocks</w:t>
       </w:r>
+      <w:bookmarkEnd w:id="3"/>
     </w:p>
     <w:p>
       <w:r>
@@ -855,10 +1648,11 @@
       <w:pPr>
         <w:pStyle w:val="Heading2"/>
       </w:pPr>
-      <w:r>
-        <w:lastRenderedPageBreak/>
+      <w:bookmarkStart w:id="4" w:name="_Toc236848950"/>
+      <w:r>
         <w:t>Proof-of-stake protocol</w:t>
       </w:r>
+      <w:bookmarkEnd w:id="4"/>
     </w:p>
     <w:p>
       <w:pPr>
@@ -890,6 +1684,7 @@
         </w:numPr>
       </w:pPr>
       <w:r>
+        <w:lastRenderedPageBreak/>
         <w:t xml:space="preserve"> In every slot (spaced twelve seconds apart) a validator is randomly selected to be the block proposer. They bundle transactions together, execute them and determine a new 'state'. They wrap this information into a block and pass it around to other validators. </w:t>
       </w:r>
     </w:p>
@@ -936,12 +1731,489 @@
       </w:r>
     </w:p>
     <w:p>
+      <w:r>
+        <w:t>Most beginners think:</w:t>
+      </w:r>
+    </w:p>
+    <w:p>
+      <w:r>
+        <w:t xml:space="preserve">"Okay... people lock 32 ETH. But </w:t>
+      </w:r>
+      <w:r>
+        <w:rPr>
+          <w:b/>
+          <w:bCs/>
+        </w:rPr>
+        <w:t>why does that make the blockchain secure?</w:t>
+      </w:r>
+      <w:r>
+        <w:t>"</w:t>
+      </w:r>
+    </w:p>
+    <w:p>
+      <w:r>
+        <w:t>The answer is:</w:t>
+      </w:r>
+    </w:p>
+    <w:p>
+      <w:r>
+        <w:rPr>
+          <w:b/>
+          <w:bCs/>
+        </w:rPr>
+        <w:t>Because the 32 ETH is a security deposit that the validator can lose if they cheat.</w:t>
+      </w:r>
+    </w:p>
+    <w:p>
+      <w:pPr>
+        <w:rPr>
+          <w:b/>
+          <w:bCs/>
+        </w:rPr>
+      </w:pPr>
+      <w:r>
+        <w:rPr>
+          <w:b/>
+          <w:bCs/>
+        </w:rPr>
+        <w:t>Imagine you're hiring security guards</w:t>
+      </w:r>
+    </w:p>
+    <w:p>
+      <w:r>
+        <w:t>Suppose you're organizing a huge concert.</w:t>
+      </w:r>
+      <w:r>
+        <w:t xml:space="preserve"> </w:t>
+      </w:r>
+      <w:r>
+        <w:t>You need people to check tickets.</w:t>
+      </w:r>
+      <w:r>
+        <w:t xml:space="preserve"> </w:t>
+      </w:r>
+      <w:r>
+        <w:t>You can hire anyone...</w:t>
+      </w:r>
+    </w:p>
+    <w:p>
+      <w:r>
+        <w:t>...but what if one guard decides:</w:t>
+      </w:r>
+    </w:p>
+    <w:p>
+      <w:pPr>
+        <w:numPr>
+          <w:ilvl w:val="0"/>
+          <w:numId w:val="14"/>
+        </w:numPr>
+      </w:pPr>
+      <w:r>
+        <w:t xml:space="preserve">let fake tickets in </w:t>
+      </w:r>
+    </w:p>
+    <w:p>
+      <w:pPr>
+        <w:numPr>
+          <w:ilvl w:val="0"/>
+          <w:numId w:val="14"/>
+        </w:numPr>
+      </w:pPr>
+      <w:r>
+        <w:t xml:space="preserve">take bribes </w:t>
+      </w:r>
+    </w:p>
+    <w:p>
+      <w:pPr>
+        <w:numPr>
+          <w:ilvl w:val="0"/>
+          <w:numId w:val="14"/>
+        </w:numPr>
+      </w:pPr>
+      <w:r>
+        <w:t xml:space="preserve">steal money </w:t>
+      </w:r>
+    </w:p>
+    <w:p>
+      <w:r>
+        <w:t>How do you make sure guards behave?</w:t>
+      </w:r>
+    </w:p>
+    <w:p>
+      <w:r>
+        <w:t>One option:</w:t>
+      </w:r>
+    </w:p>
+    <w:p>
+      <w:r>
+        <w:t xml:space="preserve">Ask every guard to pay a </w:t>
+      </w:r>
+      <w:r>
+        <w:rPr>
+          <w:b/>
+          <w:bCs/>
+        </w:rPr>
+        <w:t>$10,000 security deposit</w:t>
+      </w:r>
+      <w:r>
+        <w:t>.</w:t>
+      </w:r>
+    </w:p>
+    <w:p>
+      <w:r>
+        <w:t>Now you tell them:</w:t>
+      </w:r>
+    </w:p>
+    <w:p>
+      <w:r>
+        <w:t>"If you do your job honestly, you'll get your deposit back plus your salary."</w:t>
+      </w:r>
+    </w:p>
+    <w:p>
+      <w:r>
+        <w:t>But...</w:t>
+      </w:r>
+    </w:p>
+    <w:p>
+      <w:r>
+        <w:t>"If you cheat, we keep your $10,000."</w:t>
+      </w:r>
+    </w:p>
+    <w:p>
+      <w:r>
+        <w:t>Would most guards cheat?</w:t>
+      </w:r>
+    </w:p>
+    <w:p>
+      <w:r>
+        <w:t>Probably not.</w:t>
+      </w:r>
+    </w:p>
+    <w:p>
+      <w:r>
+        <w:t>Why?</w:t>
+      </w:r>
+    </w:p>
+    <w:p>
+      <w:r>
+        <w:t>Because cheating costs far more than they could gain.</w:t>
+      </w:r>
+    </w:p>
+    <w:p>
+      <w:pPr>
+        <w:rPr>
+          <w:b/>
+          <w:bCs/>
+        </w:rPr>
+      </w:pPr>
+      <w:r>
+        <w:rPr>
+          <w:b/>
+          <w:bCs/>
+        </w:rPr>
+        <w:lastRenderedPageBreak/>
+        <w:t>Ethereum does exactly this</w:t>
+      </w:r>
+    </w:p>
+    <w:p>
+      <w:r>
+        <w:t>Ethereum says:</w:t>
+      </w:r>
+    </w:p>
+    <w:p>
+      <w:r>
+        <w:t>"Want to become a validator?"</w:t>
+      </w:r>
+      <w:r>
+        <w:t xml:space="preserve"> </w:t>
+      </w:r>
+      <w:r>
+        <w:t>Okay.</w:t>
+      </w:r>
+    </w:p>
+    <w:p>
+      <w:r>
+        <w:t>First:</w:t>
+      </w:r>
+    </w:p>
+    <w:p>
+      <w:r>
+        <w:t>Lock 32 ETH.</w:t>
+      </w:r>
+    </w:p>
+    <w:p>
+      <w:r>
+        <w:t>Now you're allowed to validate blocks.</w:t>
+      </w:r>
+      <w:r>
+        <w:t xml:space="preserve"> </w:t>
+      </w:r>
+      <w:r>
+        <w:t>Every few seconds Ethereum chooses validators to help create the next block.</w:t>
+      </w:r>
+      <w:r>
+        <w:t xml:space="preserve"> </w:t>
+      </w:r>
+      <w:r>
+        <w:t>If you behave correctly:</w:t>
+      </w:r>
+      <w:r>
+        <w:t xml:space="preserve"> </w:t>
+      </w:r>
+      <w:r>
+        <w:t>Earn ETH rewards</w:t>
+      </w:r>
+    </w:p>
+    <w:p>
+      <w:r>
+        <w:t>If you cheat:</w:t>
+      </w:r>
+      <w:r>
+        <w:t xml:space="preserve"> </w:t>
+      </w:r>
+      <w:r>
+        <w:t>Lose part (or all) of your 32 ETH.</w:t>
+      </w:r>
+    </w:p>
+    <w:p>
+      <w:r>
+        <w:t xml:space="preserve">This punishment is called </w:t>
+      </w:r>
+      <w:r>
+        <w:rPr>
+          <w:b/>
+          <w:bCs/>
+        </w:rPr>
+        <w:t>slashing</w:t>
+      </w:r>
+      <w:r>
+        <w:t>.</w:t>
+      </w:r>
+    </w:p>
+    <w:p>
+      <w:r>
+        <w:t>Think of slashing as:</w:t>
+      </w:r>
+    </w:p>
+    <w:p>
+      <w:r>
+        <w:t>"Your security deposit has been confiscated."</w:t>
+      </w:r>
+    </w:p>
+    <w:p>
+      <w:pPr>
+        <w:rPr>
+          <w:b/>
+          <w:bCs/>
+        </w:rPr>
+      </w:pPr>
+      <w:r>
+        <w:rPr>
+          <w:b/>
+          <w:bCs/>
+        </w:rPr>
+        <w:t>Why can't an attacker just become a validator?</w:t>
+      </w:r>
+    </w:p>
+    <w:p>
+      <w:r>
+        <w:t>They can.</w:t>
+      </w:r>
+      <w:r>
+        <w:t xml:space="preserve"> </w:t>
+      </w:r>
+      <w:r>
+        <w:t>But they must first lock:</w:t>
+      </w:r>
+      <w:r>
+        <w:t xml:space="preserve"> </w:t>
+      </w:r>
+      <w:r>
+        <w:t>32 ETH</w:t>
+      </w:r>
+      <w:r>
+        <w:t xml:space="preserve">. </w:t>
+      </w:r>
+      <w:r>
+        <w:t>If they want more influence</w:t>
+      </w:r>
+      <w:r>
+        <w:t xml:space="preserve"> t</w:t>
+      </w:r>
+      <w:r>
+        <w:t>hey need more validators.</w:t>
+      </w:r>
+    </w:p>
+    <w:p>
+      <w:r>
+        <w:t>Example:</w:t>
+      </w:r>
+    </w:p>
+    <w:p>
+      <w:r>
+        <w:t>1 validator</w:t>
+      </w:r>
+      <w:r>
+        <w:t xml:space="preserve"> -&gt; </w:t>
+      </w:r>
+      <w:r>
+        <w:t>32 ETH</w:t>
+      </w:r>
+    </w:p>
+    <w:p>
+      <w:r>
+        <w:t>10 validators?</w:t>
+      </w:r>
+    </w:p>
+    <w:p>
+      <w:r>
+        <w:t>10 × 32</w:t>
+      </w:r>
+      <w:r>
+        <w:t xml:space="preserve"> </w:t>
+      </w:r>
+      <w:r>
+        <w:t>=</w:t>
+      </w:r>
+      <w:r>
+        <w:t xml:space="preserve"> </w:t>
+      </w:r>
+      <w:r>
+        <w:t>320 ETH</w:t>
+      </w:r>
+    </w:p>
+    <w:p>
+      <w:r>
+        <w:t>100 validators?</w:t>
+      </w:r>
+    </w:p>
+    <w:p>
+      <w:r>
+        <w:t>3200 ETH</w:t>
+      </w:r>
+    </w:p>
+    <w:p>
+      <w:r>
+        <w:t>It gets expensive very quickly.</w:t>
+      </w:r>
+    </w:p>
+    <w:p>
+      <w:pPr>
+        <w:rPr>
+          <w:b/>
+          <w:bCs/>
+        </w:rPr>
+      </w:pPr>
+      <w:r>
+        <w:rPr>
+          <w:b/>
+          <w:bCs/>
+        </w:rPr>
+        <w:t>Why would an attacker lose money?</w:t>
+      </w:r>
+    </w:p>
+    <w:p>
+      <w:r>
+        <w:t>Imagine you buy</w:t>
+      </w:r>
+      <w:r>
+        <w:t xml:space="preserve"> </w:t>
+      </w:r>
+      <w:r>
+        <w:t>100,000 ETH</w:t>
+      </w:r>
+      <w:r>
+        <w:t xml:space="preserve"> </w:t>
+      </w:r>
+      <w:r>
+        <w:t>just to attack Ethereum.</w:t>
+      </w:r>
+    </w:p>
+    <w:p>
+      <w:r>
+        <w:t>If your attack succeeds:</w:t>
+      </w:r>
+    </w:p>
+    <w:p>
+      <w:pPr>
+        <w:numPr>
+          <w:ilvl w:val="0"/>
+          <w:numId w:val="15"/>
+        </w:numPr>
+      </w:pPr>
+      <w:r>
+        <w:t xml:space="preserve">people panic, </w:t>
+      </w:r>
+    </w:p>
+    <w:p>
+      <w:pPr>
+        <w:numPr>
+          <w:ilvl w:val="0"/>
+          <w:numId w:val="15"/>
+        </w:numPr>
+      </w:pPr>
+      <w:r>
+        <w:t xml:space="preserve">confidence in Ethereum drops, </w:t>
+      </w:r>
+    </w:p>
+    <w:p>
+      <w:pPr>
+        <w:numPr>
+          <w:ilvl w:val="0"/>
+          <w:numId w:val="15"/>
+        </w:numPr>
+      </w:pPr>
+      <w:r>
+        <w:t xml:space="preserve">many people sell their ETH. </w:t>
+      </w:r>
+    </w:p>
+    <w:p>
+      <w:r>
+        <w:t>What happens?</w:t>
+      </w:r>
+      <w:r>
+        <w:t xml:space="preserve"> </w:t>
+      </w:r>
+      <w:r>
+        <w:t>The price of ETH falls.</w:t>
+      </w:r>
+      <w:r>
+        <w:t xml:space="preserve"> </w:t>
+      </w:r>
+      <w:r>
+        <w:t>But what do you own?</w:t>
+      </w:r>
+      <w:r>
+        <w:t xml:space="preserve"> </w:t>
+      </w:r>
+      <w:r>
+        <w:t>100,000 ETH</w:t>
+      </w:r>
+    </w:p>
+    <w:p>
+      <w:r>
+        <w:lastRenderedPageBreak/>
+        <w:t>So</w:t>
+      </w:r>
+      <w:r>
+        <w:t>,</w:t>
+      </w:r>
+      <w:r>
+        <w:t xml:space="preserve"> your own investment loses value</w:t>
+      </w:r>
+      <w:r>
+        <w:t>!</w:t>
+      </w:r>
+    </w:p>
+    <w:p>
       <w:pPr>
         <w:pStyle w:val="Heading2"/>
       </w:pPr>
+      <w:bookmarkStart w:id="5" w:name="_Toc236848951"/>
       <w:r>
         <w:t>Block time</w:t>
       </w:r>
+      <w:bookmarkEnd w:id="5"/>
     </w:p>
     <w:p>
       <w:pPr>
@@ -1070,10 +2342,11 @@
       <w:pPr>
         <w:pStyle w:val="Heading1"/>
       </w:pPr>
-      <w:r>
-        <w:lastRenderedPageBreak/>
+      <w:bookmarkStart w:id="6" w:name="_Toc236848952"/>
+      <w:r>
         <w:t>Ethereum Virtual Machine (EVM)</w:t>
       </w:r>
+      <w:bookmarkEnd w:id="6"/>
     </w:p>
     <w:p>
       <w:pPr>
@@ -1140,9 +2413,12 @@
       <w:pPr>
         <w:pStyle w:val="Heading2"/>
       </w:pPr>
-      <w:r>
+      <w:bookmarkStart w:id="7" w:name="_Toc236848953"/>
+      <w:r>
+        <w:lastRenderedPageBreak/>
         <w:t>EVM instructions</w:t>
       </w:r>
+      <w:bookmarkEnd w:id="7"/>
     </w:p>
     <w:p>
       <w:pPr>
@@ -1221,7 +2497,6 @@
         <w:framePr w:wrap="notBeside"/>
       </w:pPr>
       <w:r>
-        <w:lastRenderedPageBreak/>
         <w:t xml:space="preserve">                 # stack contents (leftmost = top = most recent):</w:t>
       </w:r>
     </w:p>
@@ -1315,9 +2590,11 @@
       <w:pPr>
         <w:pStyle w:val="Heading2"/>
       </w:pPr>
+      <w:bookmarkStart w:id="8" w:name="_Toc236848954"/>
       <w:r>
         <w:t>Transient storage</w:t>
       </w:r>
+      <w:bookmarkEnd w:id="8"/>
     </w:p>
     <w:p>
       <w:pPr>
@@ -1588,6 +2865,7 @@
         <w:rPr>
           <w:color w:val="6600FF"/>
         </w:rPr>
+        <w:lastRenderedPageBreak/>
         <w:t xml:space="preserve">In solidity if you want to use transient storage, </w:t>
       </w:r>
       <w:r>
@@ -1699,7 +2977,6 @@
         <w:pStyle w:val="NormalWeb"/>
       </w:pPr>
       <w:r>
-        <w:lastRenderedPageBreak/>
         <w:t>So:</w:t>
       </w:r>
     </w:p>
@@ -1760,19 +3037,11 @@
         </w:rPr>
         <w:t xml:space="preserve">Tx: </w:t>
       </w:r>
-      <w:proofErr w:type="spellStart"/>
-      <w:r>
-        <w:rPr>
-          <w:color w:val="6600FF"/>
-        </w:rPr>
-        <w:t>start_game</w:t>
-      </w:r>
-      <w:proofErr w:type="spellEnd"/>
-      <w:r>
-        <w:rPr>
-          <w:color w:val="6600FF"/>
-        </w:rPr>
-        <w:t>()</w:t>
+      <w:r>
+        <w:rPr>
+          <w:color w:val="6600FF"/>
+        </w:rPr>
+        <w:t>start_game()</w:t>
       </w:r>
       <w:r>
         <w:rPr>
@@ -1784,21 +3053,7 @@
         <w:rPr>
           <w:color w:val="6600FF"/>
         </w:rPr>
-        <w:t xml:space="preserve">-&gt; storage updates: </w:t>
-      </w:r>
-      <w:proofErr w:type="spellStart"/>
-      <w:r>
-        <w:rPr>
-          <w:color w:val="6600FF"/>
-        </w:rPr>
-        <w:t>game_started</w:t>
-      </w:r>
-      <w:proofErr w:type="spellEnd"/>
-      <w:r>
-        <w:rPr>
-          <w:color w:val="6600FF"/>
-        </w:rPr>
-        <w:t xml:space="preserve"> = True, Tx ends</w:t>
+        <w:t>-&gt; storage updates: game_started = True, Tx ends</w:t>
       </w:r>
     </w:p>
     <w:p>
@@ -1816,35 +3071,13 @@
         <w:rPr>
           <w:color w:val="6600FF"/>
         </w:rPr>
-        <w:t xml:space="preserve">Tx: </w:t>
-      </w:r>
-      <w:proofErr w:type="spellStart"/>
-      <w:r>
-        <w:rPr>
-          <w:color w:val="6600FF"/>
-        </w:rPr>
-        <w:t>pass_to_messi</w:t>
-      </w:r>
-      <w:proofErr w:type="spellEnd"/>
-      <w:r>
-        <w:rPr>
-          <w:color w:val="6600FF"/>
-        </w:rPr>
-        <w:t xml:space="preserve">() [it has a </w:t>
-      </w:r>
-      <w:proofErr w:type="spellStart"/>
-      <w:r>
-        <w:rPr>
-          <w:color w:val="6600FF"/>
-        </w:rPr>
-        <w:t>front_end</w:t>
-      </w:r>
-      <w:proofErr w:type="spellEnd"/>
-      <w:r>
-        <w:rPr>
-          <w:color w:val="6600FF"/>
-        </w:rPr>
-        <w:t>]</w:t>
+        <w:t>Tx: pass_to_messi</w:t>
+      </w:r>
+      <w:r>
+        <w:rPr>
+          <w:color w:val="6600FF"/>
+        </w:rPr>
+        <w:t>() [it has a front_end]</w:t>
       </w:r>
     </w:p>
     <w:p>
@@ -1862,21 +3095,7 @@
         <w:rPr>
           <w:color w:val="6600FF"/>
         </w:rPr>
-        <w:t xml:space="preserve">Tx: </w:t>
-      </w:r>
-      <w:proofErr w:type="spellStart"/>
-      <w:r>
-        <w:rPr>
-          <w:color w:val="6600FF"/>
-        </w:rPr>
-        <w:t>see_the_result</w:t>
-      </w:r>
-      <w:proofErr w:type="spellEnd"/>
-      <w:r>
-        <w:rPr>
-          <w:color w:val="6600FF"/>
-        </w:rPr>
-        <w:t>()</w:t>
+        <w:t>Tx: see_the_result()</w:t>
       </w:r>
     </w:p>
     <w:p>
@@ -1890,21 +3109,7 @@
         <w:rPr>
           <w:color w:val="6600FF"/>
         </w:rPr>
-        <w:t xml:space="preserve">Each transaction taking 12 seconds to happen! Not Ideal for a game like </w:t>
-      </w:r>
-      <w:proofErr w:type="spellStart"/>
-      <w:r>
-        <w:rPr>
-          <w:color w:val="6600FF"/>
-        </w:rPr>
-        <w:t>fifa</w:t>
-      </w:r>
-      <w:proofErr w:type="spellEnd"/>
-      <w:r>
-        <w:rPr>
-          <w:color w:val="6600FF"/>
-        </w:rPr>
-        <w:t>!</w:t>
+        <w:t>Each transaction taking 12 seconds to happen! Not Ideal for a game like fifa!</w:t>
       </w:r>
     </w:p>
     <w:p>
@@ -1975,9 +3180,11 @@
       <w:pPr>
         <w:pStyle w:val="Heading1"/>
       </w:pPr>
+      <w:bookmarkStart w:id="9" w:name="_Toc236848955"/>
       <w:r>
         <w:t>Gas and fees</w:t>
       </w:r>
+      <w:bookmarkEnd w:id="9"/>
     </w:p>
     <w:p>
       <w:r>
@@ -1992,23 +3199,7 @@
         </w:rPr>
       </w:pPr>
       <w:r>
-        <w:t xml:space="preserve">Gas fees have to be paid in Ethereum's native currency, ether (ETH). Gas prices are usually quoted in </w:t>
-      </w:r>
-      <w:proofErr w:type="spellStart"/>
-      <w:r>
-        <w:t>gwei</w:t>
-      </w:r>
-      <w:proofErr w:type="spellEnd"/>
-      <w:r>
-        <w:t xml:space="preserve">, which is a denomination of ETH. Each </w:t>
-      </w:r>
-      <w:proofErr w:type="spellStart"/>
-      <w:r>
-        <w:t>gwei</w:t>
-      </w:r>
-      <w:proofErr w:type="spellEnd"/>
-      <w:r>
-        <w:t xml:space="preserve"> is equal to one-billionth of an ETH </w:t>
+        <w:t xml:space="preserve">Gas fees have to be paid in Ethereum's native currency, ether (ETH). Gas prices are usually quoted in gwei, which is a denomination of ETH. Each gwei is equal to one-billionth of an ETH </w:t>
       </w:r>
       <w:r>
         <w:rPr>
@@ -2041,7 +3232,14 @@
         <w:rPr>
           <w:color w:val="EE0000"/>
         </w:rPr>
-        <w:t xml:space="preserve">. If you offer too little, validators are less likely to choose your transaction for inclusion, meaning your transaction may execute late or not at all. If you offer too much, you might waste some ETH. </w:t>
+        <w:t xml:space="preserve">. If you offer too little, validators are less likely to choose your transaction for inclusion, meaning </w:t>
+      </w:r>
+      <w:r>
+        <w:rPr>
+          <w:color w:val="EE0000"/>
+        </w:rPr>
+        <w:lastRenderedPageBreak/>
+        <w:t xml:space="preserve">your transaction may execute late or not at all. If you offer too much, you might waste some ETH. </w:t>
       </w:r>
       <w:r>
         <w:t>So, how can you tell how much to pay?</w:t>
@@ -2094,14 +3292,7 @@
         <w:rPr>
           <w:color w:val="EE0000"/>
         </w:rPr>
-        <w:t xml:space="preserve">if there is </w:t>
-      </w:r>
-      <w:r>
-        <w:rPr>
-          <w:color w:val="EE0000"/>
-        </w:rPr>
-        <w:lastRenderedPageBreak/>
-        <w:t>a lot of demand then you might have to set your priority fee higher, but when there is less demand you can pay less.</w:t>
+        <w:t>if there is a lot of demand then you might have to set your priority fee higher, but when there is less demand you can pay less.</w:t>
       </w:r>
     </w:p>
     <w:p>
@@ -2226,15 +3417,7 @@
         </w:numPr>
       </w:pPr>
       <w:r>
-        <w:t xml:space="preserve">If you set </w:t>
-      </w:r>
-      <w:proofErr w:type="spellStart"/>
-      <w:r>
-        <w:t>gasLimit</w:t>
-      </w:r>
-      <w:proofErr w:type="spellEnd"/>
-      <w:r>
-        <w:t xml:space="preserve"> = 20,000, the transaction is </w:t>
+        <w:t xml:space="preserve">If you set gasLimit = 20,000, the transaction is </w:t>
       </w:r>
       <w:r>
         <w:rPr>
@@ -2311,15 +3494,7 @@
         </w:numPr>
       </w:pPr>
       <w:r>
-        <w:t xml:space="preserve">Example: </w:t>
-      </w:r>
-      <w:proofErr w:type="spellStart"/>
-      <w:r>
-        <w:t>gasLimit</w:t>
-      </w:r>
-      <w:proofErr w:type="spellEnd"/>
-      <w:r>
-        <w:t xml:space="preserve"> = 100,000, but the contract actually needs 120,000. </w:t>
+        <w:t xml:space="preserve">Example: gasLimit = 100,000, but the contract actually needs 120,000. </w:t>
       </w:r>
     </w:p>
     <w:p>
@@ -2391,6 +3566,7 @@
         <w:rPr>
           <w:color w:val="6600FF"/>
         </w:rPr>
+        <w:lastRenderedPageBreak/>
         <w:t xml:space="preserve">Because smart contracts can have </w:t>
       </w:r>
       <w:r>
@@ -2412,9 +3588,11 @@
       <w:pPr>
         <w:pStyle w:val="Heading1"/>
       </w:pPr>
+      <w:bookmarkStart w:id="10" w:name="_Toc236848956"/>
       <w:r>
         <w:t>Events and logs</w:t>
       </w:r>
+      <w:bookmarkEnd w:id="10"/>
     </w:p>
     <w:p>
       <w:pPr>
@@ -2463,7 +3641,6 @@
           <w:sz w:val="20"/>
           <w:szCs w:val="20"/>
         </w:rPr>
-        <w:lastRenderedPageBreak/>
         <w:t>pragma solidity ^0.5.10;</w:t>
       </w:r>
     </w:p>
@@ -2563,23 +3740,7 @@
           <w:sz w:val="20"/>
           <w:szCs w:val="20"/>
         </w:rPr>
-        <w:t xml:space="preserve">(address =&gt; </w:t>
-      </w:r>
-      <w:proofErr w:type="spellStart"/>
-      <w:r>
-        <w:rPr>
-          <w:sz w:val="20"/>
-          <w:szCs w:val="20"/>
-        </w:rPr>
-        <w:t>uint</w:t>
-      </w:r>
-      <w:proofErr w:type="spellEnd"/>
-      <w:r>
-        <w:rPr>
-          <w:sz w:val="20"/>
-          <w:szCs w:val="20"/>
-        </w:rPr>
-        <w:t xml:space="preserve">) public balances;  </w:t>
+        <w:t xml:space="preserve">(address =&gt; uint) public balances;  </w:t>
       </w:r>
     </w:p>
     <w:p>
@@ -2611,23 +3772,7 @@
           <w:sz w:val="20"/>
           <w:szCs w:val="20"/>
         </w:rPr>
-        <w:t xml:space="preserve">Transfer(address from, address to, </w:t>
-      </w:r>
-      <w:proofErr w:type="spellStart"/>
-      <w:r>
-        <w:rPr>
-          <w:sz w:val="20"/>
-          <w:szCs w:val="20"/>
-        </w:rPr>
-        <w:t>uint</w:t>
-      </w:r>
-      <w:proofErr w:type="spellEnd"/>
-      <w:r>
-        <w:rPr>
-          <w:sz w:val="20"/>
-          <w:szCs w:val="20"/>
-        </w:rPr>
-        <w:t xml:space="preserve"> amount);</w:t>
+        <w:t>Transfer(address from, address to, uint amount);</w:t>
       </w:r>
     </w:p>
     <w:p>
@@ -2686,23 +3831,7 @@
           <w:sz w:val="20"/>
           <w:szCs w:val="20"/>
         </w:rPr>
-        <w:t xml:space="preserve">        owner = </w:t>
-      </w:r>
-      <w:proofErr w:type="spellStart"/>
-      <w:r>
-        <w:rPr>
-          <w:sz w:val="20"/>
-          <w:szCs w:val="20"/>
-        </w:rPr>
-        <w:t>msg.sender</w:t>
-      </w:r>
-      <w:proofErr w:type="spellEnd"/>
-      <w:r>
-        <w:rPr>
-          <w:sz w:val="20"/>
-          <w:szCs w:val="20"/>
-        </w:rPr>
-        <w:t>;</w:t>
+        <w:t xml:space="preserve">        owner = msg.sender;</w:t>
       </w:r>
     </w:p>
     <w:p>
@@ -2768,56 +3897,24 @@
           <w:sz w:val="20"/>
           <w:szCs w:val="20"/>
         </w:rPr>
-        <w:t xml:space="preserve">(address receiver, </w:t>
-      </w:r>
-      <w:proofErr w:type="spellStart"/>
-      <w:r>
+        <w:t>(address receiver, uint amount) public {</w:t>
+      </w:r>
+    </w:p>
+    <w:p>
+      <w:pPr>
+        <w:pStyle w:val="codesnippet"/>
+        <w:framePr w:wrap="notBeside"/>
         <w:rPr>
           <w:sz w:val="20"/>
           <w:szCs w:val="20"/>
         </w:rPr>
-        <w:t>uint</w:t>
-      </w:r>
-      <w:proofErr w:type="spellEnd"/>
+      </w:pPr>
       <w:r>
         <w:rPr>
           <w:sz w:val="20"/>
           <w:szCs w:val="20"/>
         </w:rPr>
-        <w:t xml:space="preserve"> amount) public {</w:t>
-      </w:r>
-    </w:p>
-    <w:p>
-      <w:pPr>
-        <w:pStyle w:val="codesnippet"/>
-        <w:framePr w:wrap="notBeside"/>
-        <w:rPr>
-          <w:sz w:val="20"/>
-          <w:szCs w:val="20"/>
-        </w:rPr>
-      </w:pPr>
-      <w:r>
-        <w:rPr>
-          <w:sz w:val="20"/>
-          <w:szCs w:val="20"/>
-        </w:rPr>
-        <w:t xml:space="preserve">        require(</w:t>
-      </w:r>
-      <w:proofErr w:type="spellStart"/>
-      <w:r>
-        <w:rPr>
-          <w:sz w:val="20"/>
-          <w:szCs w:val="20"/>
-        </w:rPr>
-        <w:t>msg.sender</w:t>
-      </w:r>
-      <w:proofErr w:type="spellEnd"/>
-      <w:r>
-        <w:rPr>
-          <w:sz w:val="20"/>
-          <w:szCs w:val="20"/>
-        </w:rPr>
-        <w:t xml:space="preserve"> == owner, "You are not the owner.");</w:t>
+        <w:t xml:space="preserve">        require(msg.sender == owner, "You are not the owner.");</w:t>
       </w:r>
     </w:p>
     <w:p>
@@ -2910,23 +4007,24 @@
           <w:sz w:val="20"/>
           <w:szCs w:val="20"/>
         </w:rPr>
-        <w:t xml:space="preserve">(address receiver, </w:t>
-      </w:r>
-      <w:proofErr w:type="spellStart"/>
-      <w:r>
+        <w:t>(address receiver, uint amount) public {</w:t>
+      </w:r>
+    </w:p>
+    <w:p>
+      <w:pPr>
+        <w:pStyle w:val="codesnippet"/>
+        <w:framePr w:wrap="notBeside"/>
         <w:rPr>
           <w:sz w:val="20"/>
           <w:szCs w:val="20"/>
         </w:rPr>
-        <w:t>uint</w:t>
-      </w:r>
-      <w:proofErr w:type="spellEnd"/>
+      </w:pPr>
       <w:r>
         <w:rPr>
           <w:sz w:val="20"/>
           <w:szCs w:val="20"/>
         </w:rPr>
-        <w:t xml:space="preserve"> amount) public {</w:t>
+        <w:t xml:space="preserve">        require(amount &lt;= balances[msg.sender], "Insufficient balance.");</w:t>
       </w:r>
     </w:p>
     <w:p>
@@ -2943,23 +4041,24 @@
           <w:sz w:val="20"/>
           <w:szCs w:val="20"/>
         </w:rPr>
-        <w:t xml:space="preserve">        require(amount &lt;= balances[</w:t>
-      </w:r>
-      <w:proofErr w:type="spellStart"/>
-      <w:r>
+        <w:t xml:space="preserve">        balances[msg.sender] -= amount;</w:t>
+      </w:r>
+    </w:p>
+    <w:p>
+      <w:pPr>
+        <w:pStyle w:val="codesnippet"/>
+        <w:framePr w:wrap="notBeside"/>
         <w:rPr>
           <w:sz w:val="20"/>
           <w:szCs w:val="20"/>
         </w:rPr>
-        <w:t>msg.sender</w:t>
-      </w:r>
-      <w:proofErr w:type="spellEnd"/>
+      </w:pPr>
       <w:r>
         <w:rPr>
           <w:sz w:val="20"/>
           <w:szCs w:val="20"/>
         </w:rPr>
-        <w:t>], "Insufficient balance.");</w:t>
+        <w:t xml:space="preserve">        balances[receiver] += amount;</w:t>
       </w:r>
     </w:p>
     <w:p>
@@ -2976,73 +4075,7 @@
           <w:sz w:val="20"/>
           <w:szCs w:val="20"/>
         </w:rPr>
-        <w:t xml:space="preserve">        balances[</w:t>
-      </w:r>
-      <w:proofErr w:type="spellStart"/>
-      <w:r>
-        <w:rPr>
-          <w:sz w:val="20"/>
-          <w:szCs w:val="20"/>
-        </w:rPr>
-        <w:t>msg.sender</w:t>
-      </w:r>
-      <w:proofErr w:type="spellEnd"/>
-      <w:r>
-        <w:rPr>
-          <w:sz w:val="20"/>
-          <w:szCs w:val="20"/>
-        </w:rPr>
-        <w:t>] -= amount;</w:t>
-      </w:r>
-    </w:p>
-    <w:p>
-      <w:pPr>
-        <w:pStyle w:val="codesnippet"/>
-        <w:framePr w:wrap="notBeside"/>
-        <w:rPr>
-          <w:sz w:val="20"/>
-          <w:szCs w:val="20"/>
-        </w:rPr>
-      </w:pPr>
-      <w:r>
-        <w:rPr>
-          <w:sz w:val="20"/>
-          <w:szCs w:val="20"/>
-        </w:rPr>
-        <w:t xml:space="preserve">        balances[receiver] += amount;</w:t>
-      </w:r>
-    </w:p>
-    <w:p>
-      <w:pPr>
-        <w:pStyle w:val="codesnippet"/>
-        <w:framePr w:wrap="notBeside"/>
-        <w:rPr>
-          <w:sz w:val="20"/>
-          <w:szCs w:val="20"/>
-        </w:rPr>
-      </w:pPr>
-      <w:r>
-        <w:rPr>
-          <w:sz w:val="20"/>
-          <w:szCs w:val="20"/>
-        </w:rPr>
-        <w:t xml:space="preserve">        emit Transfer(</w:t>
-      </w:r>
-      <w:proofErr w:type="spellStart"/>
-      <w:r>
-        <w:rPr>
-          <w:sz w:val="20"/>
-          <w:szCs w:val="20"/>
-        </w:rPr>
-        <w:t>msg.sender</w:t>
-      </w:r>
-      <w:proofErr w:type="spellEnd"/>
-      <w:r>
-        <w:rPr>
-          <w:sz w:val="20"/>
-          <w:szCs w:val="20"/>
-        </w:rPr>
-        <w:t>, receiver, amount);</w:t>
+        <w:t xml:space="preserve">        emit Transfer(msg.sender, receiver, amount);</w:t>
       </w:r>
     </w:p>
     <w:p>
@@ -3157,19 +4190,11 @@
           <w:color w:val="6600FF"/>
         </w:rPr>
       </w:pPr>
-      <w:proofErr w:type="spellStart"/>
-      <w:r>
-        <w:rPr>
-          <w:color w:val="6600FF"/>
-        </w:rPr>
-        <w:t>recordMatch</w:t>
-      </w:r>
-      <w:proofErr w:type="spellEnd"/>
-      <w:r>
-        <w:rPr>
-          <w:color w:val="6600FF"/>
-        </w:rPr>
-        <w:t>(winner, score);</w:t>
+      <w:r>
+        <w:rPr>
+          <w:color w:val="6600FF"/>
+        </w:rPr>
+        <w:t>recordMatch(winner, score);</w:t>
       </w:r>
     </w:p>
     <w:p>
@@ -3234,6 +4259,7 @@
         <w:rPr>
           <w:color w:val="6600FF"/>
         </w:rPr>
+        <w:lastRenderedPageBreak/>
         <w:t xml:space="preserve">Emits an event: </w:t>
       </w:r>
     </w:p>
@@ -3247,21 +4273,7 @@
         <w:rPr>
           <w:color w:val="6600FF"/>
         </w:rPr>
-        <w:t xml:space="preserve">emit </w:t>
-      </w:r>
-      <w:proofErr w:type="spellStart"/>
-      <w:r>
-        <w:rPr>
-          <w:color w:val="6600FF"/>
-        </w:rPr>
-        <w:t>MatchFinished</w:t>
-      </w:r>
-      <w:proofErr w:type="spellEnd"/>
-      <w:r>
-        <w:rPr>
-          <w:color w:val="6600FF"/>
-        </w:rPr>
-        <w:t>(winner, score);</w:t>
+        <w:t>emit MatchFinished(winner, score);</w:t>
       </w:r>
     </w:p>
     <w:p>
@@ -3294,7 +4306,6 @@
         </w:rPr>
         <w:t xml:space="preserve"> or </w:t>
       </w:r>
-      <w:proofErr w:type="spellStart"/>
       <w:r>
         <w:rPr>
           <w:b/>
@@ -3303,7 +4314,6 @@
         </w:rPr>
         <w:t>viem</w:t>
       </w:r>
-      <w:proofErr w:type="spellEnd"/>
       <w:r>
         <w:rPr>
           <w:color w:val="EE0000"/>
@@ -3317,33 +4327,11 @@
           <w:color w:val="EE0000"/>
         </w:rPr>
       </w:pPr>
-      <w:proofErr w:type="spellStart"/>
       <w:r>
         <w:rPr>
           <w:color w:val="EE0000"/>
         </w:rPr>
-        <w:t>contract.on</w:t>
-      </w:r>
-      <w:proofErr w:type="spellEnd"/>
-      <w:r>
-        <w:rPr>
-          <w:color w:val="EE0000"/>
-        </w:rPr>
-        <w:t>("</w:t>
-      </w:r>
-      <w:proofErr w:type="spellStart"/>
-      <w:r>
-        <w:rPr>
-          <w:color w:val="EE0000"/>
-        </w:rPr>
-        <w:t>MatchFinished</w:t>
-      </w:r>
-      <w:proofErr w:type="spellEnd"/>
-      <w:r>
-        <w:rPr>
-          <w:color w:val="EE0000"/>
-        </w:rPr>
-        <w:t>", (winner, score) =&gt; {</w:t>
+        <w:t>contract.on("MatchFinished", (winner, score) =&gt; {</w:t>
       </w:r>
     </w:p>
     <w:p>
@@ -3384,7 +4372,7 @@
 </file>
 
 <file path=word/numbering.xml><?xml version="1.0" encoding="utf-8"?>
-<w:numbering xmlns:wpc="http://schemas.microsoft.com/office/word/2010/wordprocessingCanvas" xmlns:cx="http://schemas.microsoft.com/office/drawing/2014/chartex" xmlns:cx1="http://schemas.microsoft.com/office/drawing/2015/9/8/chartex" xmlns:cx2="http://schemas.microsoft.com/office/drawing/2015/10/21/chartex" xmlns:cx3="http://schemas.microsoft.com/office/drawing/2016/5/9/chartex" xmlns:cx4="http://schemas.microsoft.com/office/drawing/2016/5/10/chartex" xmlns:cx5="http://schemas.microsoft.com/office/drawing/2016/5/11/chartex" xmlns:cx6="http://schemas.microsoft.com/office/drawing/2016/5/12/chartex" xmlns:cx7="http://schemas.microsoft.com/office/drawing/2016/5/13/chartex" xmlns:cx8="http://schemas.microsoft.com/office/drawing/2016/5/14/chartex" xmlns:mc="http://schemas.openxmlformats.org/markup-compatibility/2006" xmlns:aink="http://schemas.microsoft.com/office/drawing/2016/ink" xmlns:am3d="http://schemas.microsoft.com/office/drawing/2017/model3d" xmlns:o="urn:schemas-microsoft-com:office:office" xmlns:oel="http://schemas.microsoft.com/office/2019/extlst" xmlns:r="http://schemas.openxmlformats.org/officeDocument/2006/relationships" xmlns:m="http://schemas.openxmlformats.org/officeDocument/2006/math" xmlns:v="urn:schemas-microsoft-com:vml" xmlns:wp14="http://schemas.microsoft.com/office/word/2010/wordprocessingDrawing" xmlns:wp="http://schemas.openxmlformats.org/drawingml/2006/wordprocessingDrawing" xmlns:w10="urn:schemas-microsoft-com:office:word" xmlns:w="http://schemas.openxmlformats.org/wordprocessingml/2006/main" xmlns:w14="http://schemas.microsoft.com/office/word/2010/wordml" xmlns:w15="http://schemas.microsoft.com/office/word/2012/wordml" xmlns:w16cex="http://schemas.microsoft.com/office/word/2018/wordml/cex" xmlns:w16cid="http://schemas.microsoft.com/office/word/2016/wordml/cid" xmlns:w16="http://schemas.microsoft.com/office/word/2018/wordml" xmlns:w16du="http://schemas.microsoft.com/office/word/2023/wordml/word16du" xmlns:w16sdtdh="http://schemas.microsoft.com/office/word/2020/wordml/sdtdatahash" xmlns:w16sdtfl="http://schemas.microsoft.com/office/word/2024/wordml/sdtformatlock" xmlns:w16se="http://schemas.microsoft.com/office/word/2015/wordml/symex" xmlns:wpg="http://schemas.microsoft.com/office/word/2010/wordprocessingGroup" xmlns:wpi="http://schemas.microsoft.com/office/word/2010/wordprocessingInk" xmlns:wne="http://schemas.microsoft.com/office/word/2006/wordml" xmlns:wps="http://schemas.microsoft.com/office/word/2010/wordprocessingShape" mc:Ignorable="w14 w15 w16se w16cid w16 w16cex w16sdtdh w16sdtfl w16du wp14">
+<w:numbering xmlns:wpc="http://schemas.microsoft.com/office/word/2010/wordprocessingCanvas" xmlns:cx="http://schemas.microsoft.com/office/drawing/2014/chartex" xmlns:cx1="http://schemas.microsoft.com/office/drawing/2015/9/8/chartex" xmlns:cx2="http://schemas.microsoft.com/office/drawing/2015/10/21/chartex" xmlns:cx3="http://schemas.microsoft.com/office/drawing/2016/5/9/chartex" xmlns:cx4="http://schemas.microsoft.com/office/drawing/2016/5/10/chartex" xmlns:cx5="http://schemas.microsoft.com/office/drawing/2016/5/11/chartex" xmlns:cx6="http://schemas.microsoft.com/office/drawing/2016/5/12/chartex" xmlns:cx7="http://schemas.microsoft.com/office/drawing/2016/5/13/chartex" xmlns:cx8="http://schemas.microsoft.com/office/drawing/2016/5/14/chartex" xmlns:mc="http://schemas.openxmlformats.org/markup-compatibility/2006" xmlns:aink="http://schemas.microsoft.com/office/drawing/2016/ink" xmlns:am3d="http://schemas.microsoft.com/office/drawing/2017/model3d" xmlns:o="urn:schemas-microsoft-com:office:office" xmlns:oel="http://schemas.microsoft.com/office/2019/extlst" xmlns:r="http://schemas.openxmlformats.org/officeDocument/2006/relationships" xmlns:m="http://schemas.openxmlformats.org/officeDocument/2006/math" xmlns:v="urn:schemas-microsoft-com:vml" xmlns:wp14="http://schemas.microsoft.com/office/word/2010/wordprocessingDrawing" xmlns:wp="http://schemas.openxmlformats.org/drawingml/2006/wordprocessingDrawing" xmlns:w10="urn:schemas-microsoft-com:office:word" xmlns:w="http://schemas.openxmlformats.org/wordprocessingml/2006/main" xmlns:w14="http://schemas.microsoft.com/office/word/2010/wordml" xmlns:w15="http://schemas.microsoft.com/office/word/2012/wordml" xmlns:w16cei="http://schemas.microsoft.com/office/word/2026/wordml/cei" xmlns:w16cex="http://schemas.microsoft.com/office/word/2018/wordml/cex" xmlns:w16cid="http://schemas.microsoft.com/office/word/2016/wordml/cid" xmlns:w16="http://schemas.microsoft.com/office/word/2018/wordml" xmlns:w16du="http://schemas.microsoft.com/office/word/2023/wordml/word16du" xmlns:w16sdtdh="http://schemas.microsoft.com/office/word/2020/wordml/sdtdatahash" xmlns:w16sdtfl="http://schemas.microsoft.com/office/word/2024/wordml/sdtformatlock" xmlns:w16se="http://schemas.microsoft.com/office/word/2015/wordml/symex" xmlns:wpg="http://schemas.microsoft.com/office/word/2010/wordprocessingGroup" xmlns:wpi="http://schemas.microsoft.com/office/word/2010/wordprocessingInk" xmlns:wne="http://schemas.microsoft.com/office/word/2006/wordml" xmlns:wps="http://schemas.microsoft.com/office/word/2010/wordprocessingShape" mc:Ignorable="w14 w15 w16se w16cid w16 w16cex w16sdtdh w16sdtfl w16du wp14">
   <w:abstractNum w:abstractNumId="0" w15:restartNumberingAfterBreak="0">
     <w:nsid w:val="078F2AD7"/>
     <w:multiLevelType w:val="multilevel"/>
@@ -4704,6 +5692,304 @@
     </w:lvl>
   </w:abstractNum>
   <w:abstractNum w:abstractNumId="10" w15:restartNumberingAfterBreak="0">
+    <w:nsid w:val="46404E3B"/>
+    <w:multiLevelType w:val="multilevel"/>
+    <w:tmpl w:val="F698C0DE"/>
+    <w:lvl w:ilvl="0">
+      <w:start w:val="1"/>
+      <w:numFmt w:val="bullet"/>
+      <w:lvlText w:val=""/>
+      <w:lvlJc w:val="left"/>
+      <w:pPr>
+        <w:tabs>
+          <w:tab w:val="num" w:pos="720"/>
+        </w:tabs>
+        <w:ind w:left="720" w:hanging="360"/>
+      </w:pPr>
+      <w:rPr>
+        <w:rFonts w:ascii="Symbol" w:hAnsi="Symbol" w:hint="default"/>
+        <w:sz w:val="20"/>
+      </w:rPr>
+    </w:lvl>
+    <w:lvl w:ilvl="1" w:tentative="1">
+      <w:start w:val="1"/>
+      <w:numFmt w:val="bullet"/>
+      <w:lvlText w:val="o"/>
+      <w:lvlJc w:val="left"/>
+      <w:pPr>
+        <w:tabs>
+          <w:tab w:val="num" w:pos="1440"/>
+        </w:tabs>
+        <w:ind w:left="1440" w:hanging="360"/>
+      </w:pPr>
+      <w:rPr>
+        <w:rFonts w:ascii="Courier New" w:hAnsi="Courier New" w:hint="default"/>
+        <w:sz w:val="20"/>
+      </w:rPr>
+    </w:lvl>
+    <w:lvl w:ilvl="2" w:tentative="1">
+      <w:start w:val="1"/>
+      <w:numFmt w:val="bullet"/>
+      <w:lvlText w:val=""/>
+      <w:lvlJc w:val="left"/>
+      <w:pPr>
+        <w:tabs>
+          <w:tab w:val="num" w:pos="2160"/>
+        </w:tabs>
+        <w:ind w:left="2160" w:hanging="360"/>
+      </w:pPr>
+      <w:rPr>
+        <w:rFonts w:ascii="Wingdings" w:hAnsi="Wingdings" w:hint="default"/>
+        <w:sz w:val="20"/>
+      </w:rPr>
+    </w:lvl>
+    <w:lvl w:ilvl="3" w:tentative="1">
+      <w:start w:val="1"/>
+      <w:numFmt w:val="bullet"/>
+      <w:lvlText w:val=""/>
+      <w:lvlJc w:val="left"/>
+      <w:pPr>
+        <w:tabs>
+          <w:tab w:val="num" w:pos="2880"/>
+        </w:tabs>
+        <w:ind w:left="2880" w:hanging="360"/>
+      </w:pPr>
+      <w:rPr>
+        <w:rFonts w:ascii="Wingdings" w:hAnsi="Wingdings" w:hint="default"/>
+        <w:sz w:val="20"/>
+      </w:rPr>
+    </w:lvl>
+    <w:lvl w:ilvl="4" w:tentative="1">
+      <w:start w:val="1"/>
+      <w:numFmt w:val="bullet"/>
+      <w:lvlText w:val=""/>
+      <w:lvlJc w:val="left"/>
+      <w:pPr>
+        <w:tabs>
+          <w:tab w:val="num" w:pos="3600"/>
+        </w:tabs>
+        <w:ind w:left="3600" w:hanging="360"/>
+      </w:pPr>
+      <w:rPr>
+        <w:rFonts w:ascii="Wingdings" w:hAnsi="Wingdings" w:hint="default"/>
+        <w:sz w:val="20"/>
+      </w:rPr>
+    </w:lvl>
+    <w:lvl w:ilvl="5" w:tentative="1">
+      <w:start w:val="1"/>
+      <w:numFmt w:val="bullet"/>
+      <w:lvlText w:val=""/>
+      <w:lvlJc w:val="left"/>
+      <w:pPr>
+        <w:tabs>
+          <w:tab w:val="num" w:pos="4320"/>
+        </w:tabs>
+        <w:ind w:left="4320" w:hanging="360"/>
+      </w:pPr>
+      <w:rPr>
+        <w:rFonts w:ascii="Wingdings" w:hAnsi="Wingdings" w:hint="default"/>
+        <w:sz w:val="20"/>
+      </w:rPr>
+    </w:lvl>
+    <w:lvl w:ilvl="6" w:tentative="1">
+      <w:start w:val="1"/>
+      <w:numFmt w:val="bullet"/>
+      <w:lvlText w:val=""/>
+      <w:lvlJc w:val="left"/>
+      <w:pPr>
+        <w:tabs>
+          <w:tab w:val="num" w:pos="5040"/>
+        </w:tabs>
+        <w:ind w:left="5040" w:hanging="360"/>
+      </w:pPr>
+      <w:rPr>
+        <w:rFonts w:ascii="Wingdings" w:hAnsi="Wingdings" w:hint="default"/>
+        <w:sz w:val="20"/>
+      </w:rPr>
+    </w:lvl>
+    <w:lvl w:ilvl="7" w:tentative="1">
+      <w:start w:val="1"/>
+      <w:numFmt w:val="bullet"/>
+      <w:lvlText w:val=""/>
+      <w:lvlJc w:val="left"/>
+      <w:pPr>
+        <w:tabs>
+          <w:tab w:val="num" w:pos="5760"/>
+        </w:tabs>
+        <w:ind w:left="5760" w:hanging="360"/>
+      </w:pPr>
+      <w:rPr>
+        <w:rFonts w:ascii="Wingdings" w:hAnsi="Wingdings" w:hint="default"/>
+        <w:sz w:val="20"/>
+      </w:rPr>
+    </w:lvl>
+    <w:lvl w:ilvl="8" w:tentative="1">
+      <w:start w:val="1"/>
+      <w:numFmt w:val="bullet"/>
+      <w:lvlText w:val=""/>
+      <w:lvlJc w:val="left"/>
+      <w:pPr>
+        <w:tabs>
+          <w:tab w:val="num" w:pos="6480"/>
+        </w:tabs>
+        <w:ind w:left="6480" w:hanging="360"/>
+      </w:pPr>
+      <w:rPr>
+        <w:rFonts w:ascii="Wingdings" w:hAnsi="Wingdings" w:hint="default"/>
+        <w:sz w:val="20"/>
+      </w:rPr>
+    </w:lvl>
+  </w:abstractNum>
+  <w:abstractNum w:abstractNumId="11" w15:restartNumberingAfterBreak="0">
+    <w:nsid w:val="6006148B"/>
+    <w:multiLevelType w:val="multilevel"/>
+    <w:tmpl w:val="BFB05E54"/>
+    <w:lvl w:ilvl="0">
+      <w:start w:val="1"/>
+      <w:numFmt w:val="bullet"/>
+      <w:lvlText w:val=""/>
+      <w:lvlJc w:val="left"/>
+      <w:pPr>
+        <w:tabs>
+          <w:tab w:val="num" w:pos="720"/>
+        </w:tabs>
+        <w:ind w:left="720" w:hanging="360"/>
+      </w:pPr>
+      <w:rPr>
+        <w:rFonts w:ascii="Symbol" w:hAnsi="Symbol" w:hint="default"/>
+        <w:sz w:val="20"/>
+      </w:rPr>
+    </w:lvl>
+    <w:lvl w:ilvl="1" w:tentative="1">
+      <w:start w:val="1"/>
+      <w:numFmt w:val="bullet"/>
+      <w:lvlText w:val="o"/>
+      <w:lvlJc w:val="left"/>
+      <w:pPr>
+        <w:tabs>
+          <w:tab w:val="num" w:pos="1440"/>
+        </w:tabs>
+        <w:ind w:left="1440" w:hanging="360"/>
+      </w:pPr>
+      <w:rPr>
+        <w:rFonts w:ascii="Courier New" w:hAnsi="Courier New" w:hint="default"/>
+        <w:sz w:val="20"/>
+      </w:rPr>
+    </w:lvl>
+    <w:lvl w:ilvl="2" w:tentative="1">
+      <w:start w:val="1"/>
+      <w:numFmt w:val="bullet"/>
+      <w:lvlText w:val=""/>
+      <w:lvlJc w:val="left"/>
+      <w:pPr>
+        <w:tabs>
+          <w:tab w:val="num" w:pos="2160"/>
+        </w:tabs>
+        <w:ind w:left="2160" w:hanging="360"/>
+      </w:pPr>
+      <w:rPr>
+        <w:rFonts w:ascii="Wingdings" w:hAnsi="Wingdings" w:hint="default"/>
+        <w:sz w:val="20"/>
+      </w:rPr>
+    </w:lvl>
+    <w:lvl w:ilvl="3" w:tentative="1">
+      <w:start w:val="1"/>
+      <w:numFmt w:val="bullet"/>
+      <w:lvlText w:val=""/>
+      <w:lvlJc w:val="left"/>
+      <w:pPr>
+        <w:tabs>
+          <w:tab w:val="num" w:pos="2880"/>
+        </w:tabs>
+        <w:ind w:left="2880" w:hanging="360"/>
+      </w:pPr>
+      <w:rPr>
+        <w:rFonts w:ascii="Wingdings" w:hAnsi="Wingdings" w:hint="default"/>
+        <w:sz w:val="20"/>
+      </w:rPr>
+    </w:lvl>
+    <w:lvl w:ilvl="4" w:tentative="1">
+      <w:start w:val="1"/>
+      <w:numFmt w:val="bullet"/>
+      <w:lvlText w:val=""/>
+      <w:lvlJc w:val="left"/>
+      <w:pPr>
+        <w:tabs>
+          <w:tab w:val="num" w:pos="3600"/>
+        </w:tabs>
+        <w:ind w:left="3600" w:hanging="360"/>
+      </w:pPr>
+      <w:rPr>
+        <w:rFonts w:ascii="Wingdings" w:hAnsi="Wingdings" w:hint="default"/>
+        <w:sz w:val="20"/>
+      </w:rPr>
+    </w:lvl>
+    <w:lvl w:ilvl="5" w:tentative="1">
+      <w:start w:val="1"/>
+      <w:numFmt w:val="bullet"/>
+      <w:lvlText w:val=""/>
+      <w:lvlJc w:val="left"/>
+      <w:pPr>
+        <w:tabs>
+          <w:tab w:val="num" w:pos="4320"/>
+        </w:tabs>
+        <w:ind w:left="4320" w:hanging="360"/>
+      </w:pPr>
+      <w:rPr>
+        <w:rFonts w:ascii="Wingdings" w:hAnsi="Wingdings" w:hint="default"/>
+        <w:sz w:val="20"/>
+      </w:rPr>
+    </w:lvl>
+    <w:lvl w:ilvl="6" w:tentative="1">
+      <w:start w:val="1"/>
+      <w:numFmt w:val="bullet"/>
+      <w:lvlText w:val=""/>
+      <w:lvlJc w:val="left"/>
+      <w:pPr>
+        <w:tabs>
+          <w:tab w:val="num" w:pos="5040"/>
+        </w:tabs>
+        <w:ind w:left="5040" w:hanging="360"/>
+      </w:pPr>
+      <w:rPr>
+        <w:rFonts w:ascii="Wingdings" w:hAnsi="Wingdings" w:hint="default"/>
+        <w:sz w:val="20"/>
+      </w:rPr>
+    </w:lvl>
+    <w:lvl w:ilvl="7" w:tentative="1">
+      <w:start w:val="1"/>
+      <w:numFmt w:val="bullet"/>
+      <w:lvlText w:val=""/>
+      <w:lvlJc w:val="left"/>
+      <w:pPr>
+        <w:tabs>
+          <w:tab w:val="num" w:pos="5760"/>
+        </w:tabs>
+        <w:ind w:left="5760" w:hanging="360"/>
+      </w:pPr>
+      <w:rPr>
+        <w:rFonts w:ascii="Wingdings" w:hAnsi="Wingdings" w:hint="default"/>
+        <w:sz w:val="20"/>
+      </w:rPr>
+    </w:lvl>
+    <w:lvl w:ilvl="8" w:tentative="1">
+      <w:start w:val="1"/>
+      <w:numFmt w:val="bullet"/>
+      <w:lvlText w:val=""/>
+      <w:lvlJc w:val="left"/>
+      <w:pPr>
+        <w:tabs>
+          <w:tab w:val="num" w:pos="6480"/>
+        </w:tabs>
+        <w:ind w:left="6480" w:hanging="360"/>
+      </w:pPr>
+      <w:rPr>
+        <w:rFonts w:ascii="Wingdings" w:hAnsi="Wingdings" w:hint="default"/>
+        <w:sz w:val="20"/>
+      </w:rPr>
+    </w:lvl>
+  </w:abstractNum>
+  <w:abstractNum w:abstractNumId="12" w15:restartNumberingAfterBreak="0">
     <w:nsid w:val="6D175855"/>
     <w:multiLevelType w:val="hybridMultilevel"/>
     <w:tmpl w:val="F2704D3C"/>
@@ -4816,7 +6102,7 @@
       </w:rPr>
     </w:lvl>
   </w:abstractNum>
-  <w:abstractNum w:abstractNumId="11" w15:restartNumberingAfterBreak="0">
+  <w:abstractNum w:abstractNumId="13" w15:restartNumberingAfterBreak="0">
     <w:nsid w:val="771A6567"/>
     <w:multiLevelType w:val="multilevel"/>
     <w:tmpl w:val="F7B8FFB0"/>
@@ -4965,7 +6251,7 @@
       </w:rPr>
     </w:lvl>
   </w:abstractNum>
-  <w:abstractNum w:abstractNumId="12" w15:restartNumberingAfterBreak="0">
+  <w:abstractNum w:abstractNumId="14" w15:restartNumberingAfterBreak="0">
     <w:nsid w:val="79434D2D"/>
     <w:multiLevelType w:val="multilevel"/>
     <w:tmpl w:val="1A72EC9E"/>
@@ -5118,16 +6404,16 @@
     <w:abstractNumId w:val="5"/>
   </w:num>
   <w:num w:numId="2" w16cid:durableId="342250291">
-    <w:abstractNumId w:val="12"/>
+    <w:abstractNumId w:val="14"/>
   </w:num>
   <w:num w:numId="3" w16cid:durableId="374277495">
     <w:abstractNumId w:val="9"/>
   </w:num>
   <w:num w:numId="4" w16cid:durableId="1136411183">
-    <w:abstractNumId w:val="11"/>
+    <w:abstractNumId w:val="13"/>
   </w:num>
   <w:num w:numId="5" w16cid:durableId="1202093790">
-    <w:abstractNumId w:val="10"/>
+    <w:abstractNumId w:val="12"/>
   </w:num>
   <w:num w:numId="6" w16cid:durableId="572279600">
     <w:abstractNumId w:val="6"/>
@@ -5152,6 +6438,12 @@
   </w:num>
   <w:num w:numId="13" w16cid:durableId="1278441941">
     <w:abstractNumId w:val="1"/>
+  </w:num>
+  <w:num w:numId="14" w16cid:durableId="1430009782">
+    <w:abstractNumId w:val="10"/>
+  </w:num>
+  <w:num w:numId="15" w16cid:durableId="561790074">
+    <w:abstractNumId w:val="11"/>
   </w:num>
 </w:numbering>
 </file>
@@ -6218,6 +7510,52 @@
       </w:tblBorders>
     </w:tblPr>
   </w:style>
+  <w:style w:type="paragraph" w:styleId="TOCHeading">
+    <w:name w:val="TOC Heading"/>
+    <w:basedOn w:val="Heading1"/>
+    <w:next w:val="Normal"/>
+    <w:uiPriority w:val="39"/>
+    <w:unhideWhenUsed/>
+    <w:qFormat/>
+    <w:rsid w:val="004D6A50"/>
+    <w:pPr>
+      <w:spacing w:before="240" w:after="0" w:line="259" w:lineRule="auto"/>
+      <w:outlineLvl w:val="9"/>
+    </w:pPr>
+    <w:rPr>
+      <w:rFonts w:asciiTheme="majorHAnsi" w:hAnsiTheme="majorHAnsi"/>
+      <w:color w:val="2F5496" w:themeColor="accent1" w:themeShade="BF"/>
+      <w:kern w:val="0"/>
+      <w:sz w:val="32"/>
+      <w:szCs w:val="32"/>
+      <w14:ligatures w14:val="none"/>
+    </w:rPr>
+  </w:style>
+  <w:style w:type="paragraph" w:styleId="TOC1">
+    <w:name w:val="toc 1"/>
+    <w:basedOn w:val="Normal"/>
+    <w:next w:val="Normal"/>
+    <w:autoRedefine/>
+    <w:uiPriority w:val="39"/>
+    <w:unhideWhenUsed/>
+    <w:rsid w:val="004D6A50"/>
+    <w:pPr>
+      <w:spacing w:after="100"/>
+    </w:pPr>
+  </w:style>
+  <w:style w:type="paragraph" w:styleId="TOC2">
+    <w:name w:val="toc 2"/>
+    <w:basedOn w:val="Normal"/>
+    <w:next w:val="Normal"/>
+    <w:autoRedefine/>
+    <w:uiPriority w:val="39"/>
+    <w:unhideWhenUsed/>
+    <w:rsid w:val="004D6A50"/>
+    <w:pPr>
+      <w:spacing w:after="100"/>
+      <w:ind w:left="240"/>
+    </w:pPr>
+  </w:style>
 </w:styles>
 </file>
 

</xml_diff>